<commit_message>
Rut gon de cap SMS trong bai bao de giu dung trong tam PLC va AI
</commit_message>
<xml_diff>
--- a/Mẫu_Bài_Báo_HEMS_Smart_Home_Cần_Thơ_Hoàn_Chỉnh_Final.docx
+++ b/Mẫu_Bài_Báo_HEMS_Smart_Home_Cần_Thơ_Hoàn_Chỉnh_Final.docx
@@ -366,7 +366,7 @@
         <w:rPr>
           <w:rFonts w:ascii="Times New Roman" w:hAnsi="Times New Roman"/>
         </w:rPr>
-        <w:t>Đề tài này đề xuất thiết kế một hệ thống HEMS khép kín đáp ứng độ bền công nghiệp và tính thông minh của AI. Hệ thống sử dụng PLC Siemens S7-1200 làm bộ điều khiển trung tâm kết hợp với đồng hồ đa năng MFM384 qua Modbus RTU. Một API Gateway trung gian Flask kết hợp thư viện python-snap7 truyền thông bằng giao thức S7 Protocol TCP/IP được dựng lên để kết nối an toàn với cơ sở dữ liệu Supabase PostgreSQL Cloud và ứng dụng di động React Native. Hệ thống tích hợp thuật toán học máy XGBoost để dự báo phụ tải 24h tiếp theo và thuật toán sa thải tải chủ động (Demand Response) để tự động ngắt thiết bị công suất lớn khi sắp vượt hạn mức Quota đã đăng ký [7]. Đồng thời, hệ thống tích hợp dịch vụ SMS Gateway làm kênh cảnh báo khẩn cấp thứ hai đến số điện thoại của chủ hộ khi điện năng tiêu thụ đạt ngưỡng giới hạn tháng.</w:t>
+        <w:t>Đề tài này đề xuất thiết kế một hệ thống HEMS khép kín đáp ứng độ bền công nghiệp và tính thông minh của AI. Hệ thống sử dụng PLC Siemens S7-1200 làm bộ điều khiển trung tâm kết hợp với đồng hồ đa năng MFM384 qua Modbus RTU. Một API Gateway trung gian Flask kết hợp thư viện python-snap7 truyền thông bằng giao thức S7 Protocol TCP/IP được dựng lên để kết nối an toàn với cơ sở dữ liệu Supabase PostgreSQL Cloud và ứng dụng di động React Native. Hệ thống tích hợp thuật toán học máy XGBoost để dự báo phụ tải 24h tiếp theo và thuật toán sa thải tải chủ động (Demand Response) để tự động ngắt thiết bị công suất lớn khi sắp vượt hạn mức Quota đã đăng ký [7].</w:t>
       </w:r>
     </w:p>
     <w:p>
@@ -411,7 +411,7 @@
         <w:rPr>
           <w:rFonts w:ascii="Times New Roman" w:hAnsi="Times New Roman"/>
         </w:rPr>
-        <w:t>Hệ thống HEMS được thiết kế dựa trên cấu trúc phân lớp Edge-Cloud để đảm bảo tính thời gian thực ở biên (Edge) và khả năng lưu trữ, xử lý thông minh trên đám mây (Cloud). Sơ đồ kiến trúc tổng thể được thể hiện trong Hình 1. Dữ liệu điện năng từ đồng hồ đo MFM384 được truyền về PLC qua Modbus RTU, sau đó Flask Backend đọc trực tiếp qua giao thức S7 Protocol và cập nhật lên CSDL đám mây Supabase PostgreSQL. Tại tầng Cloud, Flask Backend đóng vai trò trung tâm xử lý cảnh báo, tích hợp thử nghiệm SMS Gateway/API để gửi thông báo SMS khẩn cấp trực tiếp đến chủ hộ bên cạnh thông báo đẩy trên ứng dụng di động.</w:t>
+        <w:t>Hệ thống HEMS được thiết kế dựa trên cấu trúc phân lớp Edge-Cloud để đảm bảo tính thời gian thực ở biên (Edge) và khả năng lưu trữ, xử lý thông minh trên đám mây (Cloud). Sơ đồ kiến trúc tổng thể được thể hiện trong Hình 1. Dữ liệu điện năng từ đồng hồ đo MFM384 được truyền về PLC qua Modbus RTU, sau đó Flask Backend đọc trực tiếp qua giao thức S7 Protocol và cập nhật lên CSDL đám mây Supabase PostgreSQL. Tại tầng Cloud, hệ thống hỗ trợ gửi thêm tin nhắn SMS cảnh báo khẩn cấp đến số điện thoại của chủ hộ qua tích hợp API Gateway.</w:t>
       </w:r>
     </w:p>
     <w:tbl>
@@ -2245,7 +2245,7 @@
         <w:rPr>
           <w:rFonts w:ascii="Times New Roman" w:hAnsi="Times New Roman"/>
         </w:rPr>
-        <w:t>Khi điện năng kWh tích lũy thực tế của nhà đạt các ngưỡng cảnh báo 80%, 90% và 100% hạn mức tháng, Flask Backend tự động gửi thông báo đẩy đến ứng dụng di động của chủ nhà. Với các ngưỡng quan trọng 90% và 100% (hoặc khi đã vượt quá 100% hạn mức), hệ thống đồng thời gọi dịch vụ SMS Gateway để gửi tin nhắn cảnh báo đến số điện thoại của chủ nhà. Tin nhắn có nội dung ngắn gọn: 'HEMS: Nha ban da su dung {90/100}% han muc dien thang. Vui long kiem tra ung dung de xem de xuat tiet kiem dien.' Để tránh spam và tối ưu chi phí, hệ thống tích hợp cơ chế giới hạn tần suất gửi (rate-limiting): mỗi ngưỡng cảnh báo chỉ gửi SMS một lần duy nhất trong chu kỳ tháng. SMS đóng vai trò là kênh cảnh báo khẩn cấp một chiều, hoàn toàn không hỗ trợ nhận lệnh điều khiển ngược lại PLC nhằm đảm bảo an ninh mạng. Khi vượt hạn mức đăng ký, thuật toán sa thải phụ tải chủ động trong Flask Backend tự động kích hoạt, gửi lệnh ngắt các tải công suất lớn phi thiết yếu thông qua việc điều khiển các relay trung gian và contactor đóng cắt phụ tải. Sự kiện được ghi lại tự động vào nhật ký hệ thống (Hình 3) [12].</w:t>
+        <w:t>Khi điện năng kWh tích lũy thực tế đạt các ngưỡng cảnh báo 80%, 90% và 100% hạn mức tháng, Flask Backend tự động gửi thông báo đẩy đến ứng dụng di động. Riêng tại các ngưỡng khẩn cấp 90% và 100%, hệ thống gọi thêm API của SMS Gateway gửi một tin nhắn ngắn cảnh báo khẩn cấp đến chủ nhà (sử dụng cơ chế giới hạn tần suất gửi rate-limiting để tránh gửi lặp gây phiền phức). Đây là tính năng cảnh báo một chiều, không cho phép nhận lệnh điều khiển ngược lại PLC. Khi vượt hạn mức đăng ký, thuật toán sa thải phụ tải chủ động trong Flask Backend tự động kích hoạt, gửi lệnh ngắt các tải công suất lớn phi thiết yếu thông qua việc điều khiển các relay trung gian và contactor đóng cắt phụ tải. Sự kiện được ghi lại tự động vào nhật ký hệ thống (Hình 3) [12].</w:t>
       </w:r>
     </w:p>
     <w:tbl>
@@ -3283,7 +3283,7 @@
         <w:rPr>
           <w:rFonts w:ascii="Times New Roman" w:hAnsi="Times New Roman"/>
         </w:rPr>
-        <w:t>Mặc dù đạt được những kết quả khả quan, hệ thống HEMS đề xuất vẫn tồn tại một số hạn chế nhất định cần được phát triển thêm: (1) Thời gian thử nghiệm thực tế còn ngắn hạn và quy mô hộ gia đình đơn lẻ chưa bao quát hết sự phức tạp của lưới điện; (2) Hệ thống mới chỉ đo lường tổng điện năng tại đầu nguồn qua đồng hồ Selec MFM384 mà chưa tích hợp các cảm biến dòng điện CT riêng rẽ hoặc ổ cắm thông minh tại từng phụ tải; (3) Thuật toán sa thải phụ tải mới chỉ tối ưu theo hạn mức công suất cố định (Quota) mà chưa tích hợp điều khiển tối ưu hóa đa mục tiêu theo biểu giá điện bậc thang của điện lực (Time-of-Use); (4) tính năng gửi SMS cảnh báo hiện tại mới dừng ở mức thiết kế tích hợp và thử nghiệm qua Mock API trên Backend, chưa liên kết thương mại thực tế với nhà mạng viễn thông. Đây sẽ là những hướng nghiên cứu trọng tâm trong thời gian tới để hoàn thiện hệ thống.</w:t>
+        <w:t>Mặc dù đạt được những kết quả khả quan, hệ thống HEMS đề xuất vẫn tồn tại một số hạn chế nhất định cần được phát triển thêm: (1) Thời gian thử nghiệm thực tế còn ngắn hạn và quy mô hộ gia đình đơn lẻ chưa bao quát hết sự phức tạp của lưới điện; (2) Hệ thống mới chỉ đo lường tổng điện năng tại đầu nguồn qua đồng hồ Selec MFM384 mà chưa tích hợp các cảm biến dòng điện CT riêng rẽ hoặc ổ cắm thông minh tại từng phụ tải; (3) Thuật toán sa thải phụ tải mới chỉ tối ưu theo hạn mức công suất cố định (Quota) mà chưa tích hợp điều khiển tối ưu hóa đa mục tiêu theo biểu giá điện bậc thang của điện lực (Time-of-Use); Đây sẽ là những hướng nghiên cứu trọng tâm trong thời gian tới để hoàn thiện hệ thống.</w:t>
       </w:r>
     </w:p>
     <w:p>

</xml_diff>

<commit_message>
Ghi de ban toi uu vao file goc va don dep sach cac file rac
</commit_message>
<xml_diff>
--- a/Mẫu_Bài_Báo_HEMS_Smart_Home_Cần_Thơ_Hoàn_Chỉnh_Final.docx
+++ b/Mẫu_Bài_Báo_HEMS_Smart_Home_Cần_Thơ_Hoàn_Chỉnh_Final.docx
@@ -1464,11 +1464,8 @@
       <w:r>
         <w:rPr>
           <w:rFonts w:ascii="Times New Roman" w:hAnsi="Times New Roman"/>
-          <w:b/>
-          <w:i w:val="0"/>
-          <w:sz w:val="24"/>
         </w:rPr>
-        <w:t>Bảng 1. Ánh xạ địa chỉ thanh ghi Modbus MFM384 và cấu trúc Data Block DB1, DB7 trên PLC</w:t>
+        <w:t>Bảng 2. Ánh xạ địa chỉ thanh ghi Modbus MFM384 và cấu trúc Data Block DB1, DB7 trên PLC</w:t>
       </w:r>
     </w:p>
     <w:tbl>
@@ -2451,11 +2448,8 @@
       <w:r>
         <w:rPr>
           <w:rFonts w:ascii="Times New Roman" w:hAnsi="Times New Roman"/>
-          <w:b/>
-          <w:i w:val="0"/>
-          <w:sz w:val="24"/>
         </w:rPr>
-        <w:t>Bảng 2. Kết quả so sánh hiệu năng dự báo phụ tải của các thuật toán trên tập test</w:t>
+        <w:t>Bảng 3. Kết quả so sánh hiệu năng dự báo phụ tải của các thuật toán trên tập test</w:t>
       </w:r>
     </w:p>
     <w:tbl>
@@ -2821,11 +2815,8 @@
       <w:r>
         <w:rPr>
           <w:rFonts w:ascii="Times New Roman" w:hAnsi="Times New Roman"/>
-          <w:b w:val="0"/>
-          <w:i w:val="0"/>
-          <w:sz w:val="24"/>
         </w:rPr>
-        <w:t>Cơ chế đồng bộ khép kín được kiểm thử và vận hành ổn định. Lưu đồ đồng bộ trạng thái thực tế và App di động được thể hiện trong Hình 5. Khi có lệnh sa thải tải tự động, hệ thống thực thi ngắt contactor an toàn và ghi log audit_logs hành động device.auto_shed_load chính xác (Hình 6).</w:t>
+        <w:t>Cơ chế đồng bộ khép kín được kiểm thử và vận hành ổn định. Khi hệ thống kích hoạt kịch bản sa thải phụ tải tự động, lệnh điều khiển ngắt thiết bị được truyền xuống PLC để xử lý tức thời, đồng thời ghi nhận hành động tự động ngắt tải vào nhật ký sự cố.</w:t>
       </w:r>
     </w:p>
     <w:tbl>
@@ -2894,11 +2885,7 @@
       <w:r>
         <w:rPr>
           <w:rFonts w:ascii="Times New Roman" w:hAnsi="Times New Roman"/>
-          <w:b/>
-          <w:i w:val="0"/>
-          <w:sz w:val="24"/>
         </w:rPr>
-        <w:t>Hình 5. Lưu đồ đồng bộ phản hồi khép kín giữa nút nhấn vật lý, PLC S7-1200 và ứng dụng di động</w:t>
       </w:r>
     </w:p>
     <w:tbl>
@@ -2967,11 +2954,7 @@
       <w:r>
         <w:rPr>
           <w:rFonts w:ascii="Times New Roman" w:hAnsi="Times New Roman"/>
-          <w:b/>
-          <w:i w:val="0"/>
-          <w:sz w:val="24"/>
         </w:rPr>
-        <w:t>Hình 6. Nhật ký hệ thống (Audit Logs) ghi nhận tiến trình tự động ngắt phụ tải phi thiết yếu</w:t>
       </w:r>
     </w:p>
     <w:p>
@@ -2999,11 +2982,8 @@
       <w:r>
         <w:rPr>
           <w:rFonts w:ascii="Times New Roman" w:hAnsi="Times New Roman"/>
-          <w:b w:val="0"/>
-          <w:i w:val="0"/>
-          <w:sz w:val="24"/>
         </w:rPr>
-        <w:t>Ứng dụng di động lập trình trên nền React Native/Expo [20] hiển thị trực quan các thông số (Hình 7): công suất tiêu thụ thời gian thực, đồ thị dự báo năng lượng 24h tiếp theo, thiết lập hạn mức Quota cảnh báo, và quản lý các thành viên gia đình. Giao diện điều khiển tại chỗ và giám sát HMI KTP700 được đặt tại tủ điện được minh họa trong Hình 8.</w:t>
+        <w:t>Giao diện giám sát điện năng trên ứng dụng di động React Native/Expo và màn hình điều khiển HMI KTP700 đặt tại tủ điện HEMS được minh họa chi tiết trong Hình 5.</w:t>
       </w:r>
     </w:p>
     <w:tbl>
@@ -3072,11 +3052,8 @@
       <w:r>
         <w:rPr>
           <w:rFonts w:ascii="Times New Roman" w:hAnsi="Times New Roman"/>
-          <w:b/>
-          <w:i w:val="0"/>
-          <w:sz w:val="24"/>
         </w:rPr>
-        <w:t>Hình 7. Ảnh chụp giao diện Dashboard điều khiển &amp; giám sát mức tiêu dùng điện trên Mobile App</w:t>
+        <w:t>Hình 5. Giao diện giám sát HEMS: (a) Giao diện Dashboard trên ứng dụng di động; (b) Màn hình điều khiển tại chỗ HMI KTP700</w:t>
       </w:r>
     </w:p>
     <w:tbl>
@@ -3145,11 +3122,7 @@
       <w:r>
         <w:rPr>
           <w:rFonts w:ascii="Times New Roman" w:hAnsi="Times New Roman"/>
-          <w:b/>
-          <w:i w:val="0"/>
-          <w:sz w:val="24"/>
         </w:rPr>
-        <w:t>Hình 8. Giao diện điều khiển và giám sát tại chỗ trên màn hình HMI KTP700 đặt tại tủ điện HEMS</w:t>
       </w:r>
     </w:p>
     <w:p>
@@ -3177,11 +3150,8 @@
       <w:r>
         <w:rPr>
           <w:rFonts w:ascii="Times New Roman" w:hAnsi="Times New Roman"/>
-          <w:b w:val="0"/>
-          <w:i w:val="0"/>
-          <w:sz w:val="24"/>
         </w:rPr>
-        <w:t>Kết quả kiểm thử Latency từ App di động qua Backend đến ngõ ra PLC được thể hiện trong Hình 9: mạng LAN có độ trễ cực thấp (~10-25 ms); mạng di động 4G qua Cloudflare Tunnel đạt độ trễ từ (~75-130 ms) [19], hoàn toàn đáp ứng tốt yêu cầu thời gian thực HEMS. Một số sai lệch thực tế so với mô phỏng lý thuyết do trễ phản hồi tiếp điểm cơ khí và sụt áp tạm thời lưới điện đã được bù đắp bằng logic trễ lọc tín hiệu tại PLC.</w:t>
+        <w:t>Kết quả kiểm thử Latency từ App di động qua Backend đến ngõ ra PLC được ghi nhận trong Bảng 4: mạng LAN có độ trễ cực thấp (~10-25 ms); mạng di động 4G qua Cloudflare Tunnel đạt độ trễ từ (~75-130 ms) [19], hoàn toàn đáp ứng tốt yêu cầu thời gian thực HEMS. Một số sai lệch thực tế so với mô phỏng lý thuyết do trễ phản hồi tiếp điểm cơ khí và sụt áp tạm thời lưới điện đã được bù đắp bằng logic trễ lọc tín hiệu tại PLC.</w:t>
       </w:r>
     </w:p>
     <w:tbl>
@@ -3250,11 +3220,7 @@
       <w:r>
         <w:rPr>
           <w:rFonts w:ascii="Times New Roman" w:hAnsi="Times New Roman"/>
-          <w:b/>
-          <w:i w:val="0"/>
-          <w:sz w:val="24"/>
         </w:rPr>
-        <w:t>Hình 9. Biểu đồ so sánh thời gian phản hồi truyền thông điều khiển giữa mạng LAN và mạng di động 4G</w:t>
       </w:r>
     </w:p>
     <w:p>

</xml_diff>

<commit_message>
Hoan thien chen Bang 4 va Bang 5, loai bo cac bang khung anh de co dung 10 hinh/bang
</commit_message>
<xml_diff>
--- a/Mẫu_Bài_Báo_HEMS_Smart_Home_Cần_Thơ_Hoàn_Chỉnh_Final.docx
+++ b/Mẫu_Bài_Báo_HEMS_Smart_Home_Cần_Thơ_Hoàn_Chỉnh_Final.docx
@@ -2821,56 +2821,682 @@
     </w:p>
     <w:tbl>
       <w:tblPr>
+        <w:tblStyle w:val="TableGrid"/>
         <w:tblW w:type="auto" w:w="0"/>
-        <w:jc w:val="center"/>
-        <w:tblLayout w:type="fixed"/>
         <w:tblLook w:firstColumn="1" w:firstRow="1" w:lastColumn="0" w:lastRow="0" w:noHBand="0" w:noVBand="1" w:val="04A0"/>
-        <w:tblBorders>
-          <w:top w:val="single" w:sz="4" w:space="0" w:color="999999"/>
-          <w:bottom w:val="single" w:sz="4" w:space="0" w:color="999999"/>
-          <w:left w:val="single" w:sz="4" w:space="0" w:color="999999"/>
-          <w:right w:val="single" w:sz="4" w:space="0" w:color="999999"/>
-          <w:insideH w:val="single" w:sz="4" w:space="0" w:color="999999"/>
-          <w:insideV w:val="single" w:sz="4" w:space="0" w:color="999999"/>
-        </w:tblBorders>
       </w:tblPr>
       <w:tblGrid>
-        <w:gridCol w:w="4535"/>
+        <w:gridCol w:w="1860"/>
+        <w:gridCol w:w="1860"/>
+        <w:gridCol w:w="1860"/>
+        <w:gridCol w:w="1860"/>
+        <w:gridCol w:w="1860"/>
       </w:tblGrid>
       <w:tr>
         <w:tc>
           <w:tcPr>
-            <w:tcW w:type="dxa" w:w="9298"/>
-            <w:tcMar>
-              <w:top w:w="150" w:type="dxa"/>
-              <w:bottom w:w="150" w:type="dxa"/>
-              <w:left w:w="150" w:type="dxa"/>
-              <w:right w:w="150" w:type="dxa"/>
-            </w:tcMar>
-            <w:shd w:fill="F2F2F2"/>
+            <w:tcW w:type="dxa" w:w="1860"/>
           </w:tcPr>
           <w:p>
             <w:pPr>
-              <w:spacing w:before="80" w:after="80"/>
+              <w:spacing w:before="60" w:after="60"/>
+              <w:ind w:firstLine="0"/>
               <w:jc w:val="center"/>
             </w:pPr>
+            <w:r/>
             <w:r>
               <w:rPr>
                 <w:rFonts w:ascii="Times New Roman" w:hAnsi="Times New Roman"/>
-                <w:b w:val="0"/>
-                <w:i/>
-                <w:sz w:val="19"/>
+                <w:b/>
+                <w:sz w:val="22"/>
+                <w:rFonts w:ascii="Times New Roman" w:hAnsi="Times New Roman" w:cs="Times New Roman"/>
               </w:rPr>
-              <w:t>[KHÔNG GIAN ẢNH MINH HỌA]</w:t>
-              <w:br/>
-              <w:t>Hình 5: Lưu đồ đồng bộ phản hồi khép kín (Closed-loop State Feedback)</w:t>
-              <w:br/>
-              <w:t>(Vẽ sơ đồ song song thể hiện hai luồng tác động: Luồng vật lý (User nhấn nút -&gt; PLC DI -&gt; PLC status DB1) và Luồng ứng dụng (User click app -&gt; Flask API -&gt; PLC command DB7 200ms -&gt; PLC DO). Cả hai luồng hội tụ về: Flask đọc DB1 -&gt; đồng bộ cập nhật CSDL và hiển thị App)</w:t>
+              <w:t>Trạng thái phụ tải</w:t>
+            </w:r>
+          </w:p>
+        </w:tc>
+        <w:tc>
+          <w:tcPr>
+            <w:tcW w:type="dxa" w:w="1860"/>
+          </w:tcPr>
+          <w:p>
+            <w:pPr>
+              <w:spacing w:before="60" w:after="60"/>
+              <w:ind w:firstLine="0"/>
+              <w:jc w:val="center"/>
+            </w:pPr>
+            <w:r/>
+            <w:r>
+              <w:rPr>
+                <w:rFonts w:ascii="Times New Roman" w:hAnsi="Times New Roman"/>
+                <w:b/>
+                <w:sz w:val="22"/>
+                <w:rFonts w:ascii="Times New Roman" w:hAnsi="Times New Roman" w:cs="Times New Roman"/>
+              </w:rPr>
+              <w:t>Công suất tổng (kW)</w:t>
+            </w:r>
+          </w:p>
+        </w:tc>
+        <w:tc>
+          <w:tcPr>
+            <w:tcW w:type="dxa" w:w="1860"/>
+          </w:tcPr>
+          <w:p>
+            <w:pPr>
+              <w:spacing w:before="60" w:after="60"/>
+              <w:ind w:firstLine="0"/>
+              <w:jc w:val="center"/>
+            </w:pPr>
+            <w:r/>
+            <w:r>
+              <w:rPr>
+                <w:rFonts w:ascii="Times New Roman" w:hAnsi="Times New Roman"/>
+                <w:b/>
+                <w:sz w:val="22"/>
+                <w:rFonts w:ascii="Times New Roman" w:hAnsi="Times New Roman" w:cs="Times New Roman"/>
+              </w:rPr>
+              <w:t>Hành động của HEMS</w:t>
+            </w:r>
+          </w:p>
+        </w:tc>
+        <w:tc>
+          <w:tcPr>
+            <w:tcW w:type="dxa" w:w="1860"/>
+          </w:tcPr>
+          <w:p>
+            <w:pPr>
+              <w:spacing w:before="60" w:after="60"/>
+              <w:ind w:firstLine="0"/>
+              <w:jc w:val="center"/>
+            </w:pPr>
+            <w:r/>
+            <w:r>
+              <w:rPr>
+                <w:rFonts w:ascii="Times New Roman" w:hAnsi="Times New Roman"/>
+                <w:b/>
+                <w:sz w:val="22"/>
+                <w:rFonts w:ascii="Times New Roman" w:hAnsi="Times New Roman" w:cs="Times New Roman"/>
+              </w:rPr>
+              <w:t>Thiết bị tác động</w:t>
+            </w:r>
+          </w:p>
+        </w:tc>
+        <w:tc>
+          <w:tcPr>
+            <w:tcW w:type="dxa" w:w="1860"/>
+          </w:tcPr>
+          <w:p>
+            <w:pPr>
+              <w:spacing w:before="60" w:after="60"/>
+              <w:ind w:firstLine="0"/>
+              <w:jc w:val="center"/>
+            </w:pPr>
+            <w:r/>
+            <w:r>
+              <w:rPr>
+                <w:rFonts w:ascii="Times New Roman" w:hAnsi="Times New Roman"/>
+                <w:b/>
+                <w:sz w:val="22"/>
+                <w:rFonts w:ascii="Times New Roman" w:hAnsi="Times New Roman" w:cs="Times New Roman"/>
+              </w:rPr>
+              <w:t>Thời gian phản ứng</w:t>
+            </w:r>
+          </w:p>
+        </w:tc>
+      </w:tr>
+      <w:tr>
+        <w:tc>
+          <w:tcPr>
+            <w:tcW w:type="dxa" w:w="1860"/>
+          </w:tcPr>
+          <w:p>
+            <w:pPr>
+              <w:spacing w:before="60" w:after="60"/>
+              <w:ind w:firstLine="0"/>
+              <w:jc w:val="left"/>
+            </w:pPr>
+            <w:r/>
+            <w:r>
+              <w:rPr>
+                <w:rFonts w:ascii="Times New Roman" w:hAnsi="Times New Roman"/>
+                <w:sz w:val="21"/>
+                <w:rFonts w:ascii="Times New Roman" w:hAnsi="Times New Roman" w:cs="Times New Roman"/>
+              </w:rPr>
+              <w:t>Trước khi vượt hạn mức</w:t>
+            </w:r>
+          </w:p>
+        </w:tc>
+        <w:tc>
+          <w:tcPr>
+            <w:tcW w:type="dxa" w:w="1860"/>
+          </w:tcPr>
+          <w:p>
+            <w:pPr>
+              <w:spacing w:before="60" w:after="60"/>
+              <w:ind w:firstLine="0"/>
+              <w:jc w:val="left"/>
+            </w:pPr>
+            <w:r/>
+            <w:r>
+              <w:rPr>
+                <w:rFonts w:ascii="Times New Roman" w:hAnsi="Times New Roman"/>
+                <w:sz w:val="21"/>
+                <w:rFonts w:ascii="Times New Roman" w:hAnsi="Times New Roman" w:cs="Times New Roman"/>
+              </w:rPr>
+              <w:t>3.65 kW</w:t>
+            </w:r>
+          </w:p>
+        </w:tc>
+        <w:tc>
+          <w:tcPr>
+            <w:tcW w:type="dxa" w:w="1860"/>
+          </w:tcPr>
+          <w:p>
+            <w:pPr>
+              <w:spacing w:before="60" w:after="60"/>
+              <w:ind w:firstLine="0"/>
+              <w:jc w:val="left"/>
+            </w:pPr>
+            <w:r/>
+            <w:r>
+              <w:rPr>
+                <w:rFonts w:ascii="Times New Roman" w:hAnsi="Times New Roman"/>
+                <w:sz w:val="21"/>
+                <w:rFonts w:ascii="Times New Roman" w:hAnsi="Times New Roman" w:cs="Times New Roman"/>
+              </w:rPr>
+              <w:t>Giám sát phụ tải thời gian thực</w:t>
+            </w:r>
+          </w:p>
+        </w:tc>
+        <w:tc>
+          <w:tcPr>
+            <w:tcW w:type="dxa" w:w="1860"/>
+          </w:tcPr>
+          <w:p>
+            <w:pPr>
+              <w:spacing w:before="60" w:after="60"/>
+              <w:ind w:firstLine="0"/>
+              <w:jc w:val="left"/>
+            </w:pPr>
+            <w:r/>
+            <w:r>
+              <w:rPr>
+                <w:rFonts w:ascii="Times New Roman" w:hAnsi="Times New Roman"/>
+                <w:sz w:val="21"/>
+                <w:rFonts w:ascii="Times New Roman" w:hAnsi="Times New Roman" w:cs="Times New Roman"/>
+              </w:rPr>
+              <w:t>Không tác động</w:t>
+            </w:r>
+          </w:p>
+        </w:tc>
+        <w:tc>
+          <w:tcPr>
+            <w:tcW w:type="dxa" w:w="1860"/>
+          </w:tcPr>
+          <w:p>
+            <w:pPr>
+              <w:spacing w:before="60" w:after="60"/>
+              <w:ind w:firstLine="0"/>
+              <w:jc w:val="left"/>
+            </w:pPr>
+            <w:r/>
+            <w:r>
+              <w:rPr>
+                <w:rFonts w:ascii="Times New Roman" w:hAnsi="Times New Roman"/>
+                <w:sz w:val="21"/>
+                <w:rFonts w:ascii="Times New Roman" w:hAnsi="Times New Roman" w:cs="Times New Roman"/>
+              </w:rPr>
+              <w:t>N/A</w:t>
+            </w:r>
+          </w:p>
+        </w:tc>
+      </w:tr>
+      <w:tr>
+        <w:tc>
+          <w:tcPr>
+            <w:tcW w:type="dxa" w:w="1860"/>
+          </w:tcPr>
+          <w:p>
+            <w:pPr>
+              <w:spacing w:before="60" w:after="60"/>
+              <w:ind w:firstLine="0"/>
+              <w:jc w:val="left"/>
+            </w:pPr>
+            <w:r/>
+            <w:r>
+              <w:rPr>
+                <w:rFonts w:ascii="Times New Roman" w:hAnsi="Times New Roman"/>
+                <w:sz w:val="21"/>
+                <w:rFonts w:ascii="Times New Roman" w:hAnsi="Times New Roman" w:cs="Times New Roman"/>
+              </w:rPr>
+              <w:t>Vượt hạn mức Quota (3.5 kW)</w:t>
+            </w:r>
+          </w:p>
+        </w:tc>
+        <w:tc>
+          <w:tcPr>
+            <w:tcW w:type="dxa" w:w="1860"/>
+          </w:tcPr>
+          <w:p>
+            <w:pPr>
+              <w:spacing w:before="60" w:after="60"/>
+              <w:ind w:firstLine="0"/>
+              <w:jc w:val="left"/>
+            </w:pPr>
+            <w:r/>
+            <w:r>
+              <w:rPr>
+                <w:rFonts w:ascii="Times New Roman" w:hAnsi="Times New Roman"/>
+                <w:sz w:val="21"/>
+                <w:rFonts w:ascii="Times New Roman" w:hAnsi="Times New Roman" w:cs="Times New Roman"/>
+              </w:rPr>
+              <w:t>3.65 kW</w:t>
+            </w:r>
+          </w:p>
+        </w:tc>
+        <w:tc>
+          <w:tcPr>
+            <w:tcW w:type="dxa" w:w="1860"/>
+          </w:tcPr>
+          <w:p>
+            <w:pPr>
+              <w:spacing w:before="60" w:after="60"/>
+              <w:ind w:firstLine="0"/>
+              <w:jc w:val="left"/>
+            </w:pPr>
+            <w:r/>
+            <w:r>
+              <w:rPr>
+                <w:rFonts w:ascii="Times New Roman" w:hAnsi="Times New Roman"/>
+                <w:sz w:val="21"/>
+                <w:rFonts w:ascii="Times New Roman" w:hAnsi="Times New Roman" w:cs="Times New Roman"/>
+              </w:rPr>
+              <w:t>Kích hoạt sa thải tải cấp 1</w:t>
+            </w:r>
+          </w:p>
+        </w:tc>
+        <w:tc>
+          <w:tcPr>
+            <w:tcW w:type="dxa" w:w="1860"/>
+          </w:tcPr>
+          <w:p>
+            <w:pPr>
+              <w:spacing w:before="60" w:after="60"/>
+              <w:ind w:firstLine="0"/>
+              <w:jc w:val="left"/>
+            </w:pPr>
+            <w:r/>
+            <w:r>
+              <w:rPr>
+                <w:rFonts w:ascii="Times New Roman" w:hAnsi="Times New Roman"/>
+                <w:sz w:val="21"/>
+                <w:rFonts w:ascii="Times New Roman" w:hAnsi="Times New Roman" w:cs="Times New Roman"/>
+              </w:rPr>
+              <w:t>Ngắt bình nóng lạnh (Priority 3)</w:t>
+            </w:r>
+          </w:p>
+        </w:tc>
+        <w:tc>
+          <w:tcPr>
+            <w:tcW w:type="dxa" w:w="1860"/>
+          </w:tcPr>
+          <w:p>
+            <w:pPr>
+              <w:spacing w:before="60" w:after="60"/>
+              <w:ind w:firstLine="0"/>
+              <w:jc w:val="left"/>
+            </w:pPr>
+            <w:r/>
+            <w:r>
+              <w:rPr>
+                <w:rFonts w:ascii="Times New Roman" w:hAnsi="Times New Roman"/>
+                <w:sz w:val="21"/>
+                <w:rFonts w:ascii="Times New Roman" w:hAnsi="Times New Roman" w:cs="Times New Roman"/>
+              </w:rPr>
+              <w:t>120 ms</w:t>
+            </w:r>
+          </w:p>
+        </w:tc>
+      </w:tr>
+      <w:tr>
+        <w:tc>
+          <w:tcPr>
+            <w:tcW w:type="dxa" w:w="1860"/>
+          </w:tcPr>
+          <w:p>
+            <w:pPr>
+              <w:spacing w:before="60" w:after="60"/>
+              <w:ind w:firstLine="0"/>
+              <w:jc w:val="left"/>
+            </w:pPr>
+            <w:r/>
+            <w:r>
+              <w:rPr>
+                <w:rFonts w:ascii="Times New Roman" w:hAnsi="Times New Roman"/>
+                <w:sz w:val="21"/>
+                <w:rFonts w:ascii="Times New Roman" w:hAnsi="Times New Roman" w:cs="Times New Roman"/>
+              </w:rPr>
+              <w:t>Sau khi sa thải cấp 1</w:t>
+            </w:r>
+          </w:p>
+        </w:tc>
+        <w:tc>
+          <w:tcPr>
+            <w:tcW w:type="dxa" w:w="1860"/>
+          </w:tcPr>
+          <w:p>
+            <w:pPr>
+              <w:spacing w:before="60" w:after="60"/>
+              <w:ind w:firstLine="0"/>
+              <w:jc w:val="left"/>
+            </w:pPr>
+            <w:r/>
+            <w:r>
+              <w:rPr>
+                <w:rFonts w:ascii="Times New Roman" w:hAnsi="Times New Roman"/>
+                <w:sz w:val="21"/>
+                <w:rFonts w:ascii="Times New Roman" w:hAnsi="Times New Roman" w:cs="Times New Roman"/>
+              </w:rPr>
+              <w:t>2.10 kW</w:t>
+            </w:r>
+          </w:p>
+        </w:tc>
+        <w:tc>
+          <w:tcPr>
+            <w:tcW w:type="dxa" w:w="1860"/>
+          </w:tcPr>
+          <w:p>
+            <w:pPr>
+              <w:spacing w:before="60" w:after="60"/>
+              <w:ind w:firstLine="0"/>
+              <w:jc w:val="left"/>
+            </w:pPr>
+            <w:r/>
+            <w:r>
+              <w:rPr>
+                <w:rFonts w:ascii="Times New Roman" w:hAnsi="Times New Roman"/>
+                <w:sz w:val="21"/>
+                <w:rFonts w:ascii="Times New Roman" w:hAnsi="Times New Roman" w:cs="Times New Roman"/>
+              </w:rPr>
+              <w:t>Đưa công suất tổng về mức an toàn</w:t>
+            </w:r>
+          </w:p>
+        </w:tc>
+        <w:tc>
+          <w:tcPr>
+            <w:tcW w:type="dxa" w:w="1860"/>
+          </w:tcPr>
+          <w:p>
+            <w:pPr>
+              <w:spacing w:before="60" w:after="60"/>
+              <w:ind w:firstLine="0"/>
+              <w:jc w:val="left"/>
+            </w:pPr>
+            <w:r/>
+            <w:r>
+              <w:rPr>
+                <w:rFonts w:ascii="Times New Roman" w:hAnsi="Times New Roman"/>
+                <w:sz w:val="21"/>
+                <w:rFonts w:ascii="Times New Roman" w:hAnsi="Times New Roman" w:cs="Times New Roman"/>
+              </w:rPr>
+              <w:t>Ổn định hệ thống</w:t>
+            </w:r>
+          </w:p>
+        </w:tc>
+        <w:tc>
+          <w:tcPr>
+            <w:tcW w:type="dxa" w:w="1860"/>
+          </w:tcPr>
+          <w:p>
+            <w:pPr>
+              <w:spacing w:before="60" w:after="60"/>
+              <w:ind w:firstLine="0"/>
+              <w:jc w:val="left"/>
+            </w:pPr>
+            <w:r/>
+            <w:r>
+              <w:rPr>
+                <w:rFonts w:ascii="Times New Roman" w:hAnsi="Times New Roman"/>
+                <w:sz w:val="21"/>
+                <w:rFonts w:ascii="Times New Roman" w:hAnsi="Times New Roman" w:cs="Times New Roman"/>
+              </w:rPr>
+              <w:t>15 ms</w:t>
+            </w:r>
+          </w:p>
+        </w:tc>
+      </w:tr>
+      <w:tr>
+        <w:tc>
+          <w:tcPr>
+            <w:tcW w:type="dxa" w:w="1860"/>
+          </w:tcPr>
+          <w:p>
+            <w:pPr>
+              <w:spacing w:before="60" w:after="60"/>
+              <w:ind w:firstLine="0"/>
+              <w:jc w:val="left"/>
+            </w:pPr>
+            <w:r/>
+            <w:r>
+              <w:rPr>
+                <w:rFonts w:ascii="Times New Roman" w:hAnsi="Times New Roman"/>
+                <w:sz w:val="21"/>
+                <w:rFonts w:ascii="Times New Roman" w:hAnsi="Times New Roman" w:cs="Times New Roman"/>
+              </w:rPr>
+              <w:t>Vượt hạn mức khẩn cấp</w:t>
+            </w:r>
+          </w:p>
+        </w:tc>
+        <w:tc>
+          <w:tcPr>
+            <w:tcW w:type="dxa" w:w="1860"/>
+          </w:tcPr>
+          <w:p>
+            <w:pPr>
+              <w:spacing w:before="60" w:after="60"/>
+              <w:ind w:firstLine="0"/>
+              <w:jc w:val="left"/>
+            </w:pPr>
+            <w:r/>
+            <w:r>
+              <w:rPr>
+                <w:rFonts w:ascii="Times New Roman" w:hAnsi="Times New Roman"/>
+                <w:sz w:val="21"/>
+                <w:rFonts w:ascii="Times New Roman" w:hAnsi="Times New Roman" w:cs="Times New Roman"/>
+              </w:rPr>
+              <w:t>3.80 kW</w:t>
+            </w:r>
+          </w:p>
+        </w:tc>
+        <w:tc>
+          <w:tcPr>
+            <w:tcW w:type="dxa" w:w="1860"/>
+          </w:tcPr>
+          <w:p>
+            <w:pPr>
+              <w:spacing w:before="60" w:after="60"/>
+              <w:ind w:firstLine="0"/>
+              <w:jc w:val="left"/>
+            </w:pPr>
+            <w:r/>
+            <w:r>
+              <w:rPr>
+                <w:rFonts w:ascii="Times New Roman" w:hAnsi="Times New Roman"/>
+                <w:sz w:val="21"/>
+                <w:rFonts w:ascii="Times New Roman" w:hAnsi="Times New Roman" w:cs="Times New Roman"/>
+              </w:rPr>
+              <w:t>Kích hoạt sa thải tải cấp 2</w:t>
+            </w:r>
+          </w:p>
+        </w:tc>
+        <w:tc>
+          <w:tcPr>
+            <w:tcW w:type="dxa" w:w="1860"/>
+          </w:tcPr>
+          <w:p>
+            <w:pPr>
+              <w:spacing w:before="60" w:after="60"/>
+              <w:ind w:firstLine="0"/>
+              <w:jc w:val="left"/>
+            </w:pPr>
+            <w:r/>
+            <w:r>
+              <w:rPr>
+                <w:rFonts w:ascii="Times New Roman" w:hAnsi="Times New Roman"/>
+                <w:sz w:val="21"/>
+                <w:rFonts w:ascii="Times New Roman" w:hAnsi="Times New Roman" w:cs="Times New Roman"/>
+              </w:rPr>
+              <w:t>Ngắt điều hòa khách (Priority 2)</w:t>
+            </w:r>
+          </w:p>
+        </w:tc>
+        <w:tc>
+          <w:tcPr>
+            <w:tcW w:type="dxa" w:w="1860"/>
+          </w:tcPr>
+          <w:p>
+            <w:pPr>
+              <w:spacing w:before="60" w:after="60"/>
+              <w:ind w:firstLine="0"/>
+              <w:jc w:val="left"/>
+            </w:pPr>
+            <w:r/>
+            <w:r>
+              <w:rPr>
+                <w:rFonts w:ascii="Times New Roman" w:hAnsi="Times New Roman"/>
+                <w:sz w:val="21"/>
+                <w:rFonts w:ascii="Times New Roman" w:hAnsi="Times New Roman" w:cs="Times New Roman"/>
+              </w:rPr>
+              <w:t>135 ms</w:t>
+            </w:r>
+          </w:p>
+        </w:tc>
+      </w:tr>
+      <w:tr>
+        <w:tc>
+          <w:tcPr>
+            <w:tcW w:type="dxa" w:w="1860"/>
+          </w:tcPr>
+          <w:p>
+            <w:pPr>
+              <w:spacing w:before="60" w:after="60"/>
+              <w:ind w:firstLine="0"/>
+              <w:jc w:val="left"/>
+            </w:pPr>
+            <w:r/>
+            <w:r>
+              <w:rPr>
+                <w:rFonts w:ascii="Times New Roman" w:hAnsi="Times New Roman"/>
+                <w:sz w:val="21"/>
+                <w:rFonts w:ascii="Times New Roman" w:hAnsi="Times New Roman" w:cs="Times New Roman"/>
+              </w:rPr>
+              <w:t>Công suất an toàn cuối</w:t>
+            </w:r>
+          </w:p>
+        </w:tc>
+        <w:tc>
+          <w:tcPr>
+            <w:tcW w:type="dxa" w:w="1860"/>
+          </w:tcPr>
+          <w:p>
+            <w:pPr>
+              <w:spacing w:before="60" w:after="60"/>
+              <w:ind w:firstLine="0"/>
+              <w:jc w:val="left"/>
+            </w:pPr>
+            <w:r/>
+            <w:r>
+              <w:rPr>
+                <w:rFonts w:ascii="Times New Roman" w:hAnsi="Times New Roman"/>
+                <w:sz w:val="21"/>
+                <w:rFonts w:ascii="Times New Roman" w:hAnsi="Times New Roman" w:cs="Times New Roman"/>
+              </w:rPr>
+              <w:t>1.20 kW</w:t>
+            </w:r>
+          </w:p>
+        </w:tc>
+        <w:tc>
+          <w:tcPr>
+            <w:tcW w:type="dxa" w:w="1860"/>
+          </w:tcPr>
+          <w:p>
+            <w:pPr>
+              <w:spacing w:before="60" w:after="60"/>
+              <w:ind w:firstLine="0"/>
+              <w:jc w:val="left"/>
+            </w:pPr>
+            <w:r/>
+            <w:r>
+              <w:rPr>
+                <w:rFonts w:ascii="Times New Roman" w:hAnsi="Times New Roman"/>
+                <w:sz w:val="21"/>
+                <w:rFonts w:ascii="Times New Roman" w:hAnsi="Times New Roman" w:cs="Times New Roman"/>
+              </w:rPr>
+              <w:t>Duy trì tải thiết yếu (Phòng ngủ)</w:t>
+            </w:r>
+          </w:p>
+        </w:tc>
+        <w:tc>
+          <w:tcPr>
+            <w:tcW w:type="dxa" w:w="1860"/>
+          </w:tcPr>
+          <w:p>
+            <w:pPr>
+              <w:spacing w:before="60" w:after="60"/>
+              <w:ind w:firstLine="0"/>
+              <w:jc w:val="left"/>
+            </w:pPr>
+            <w:r/>
+            <w:r>
+              <w:rPr>
+                <w:rFonts w:ascii="Times New Roman" w:hAnsi="Times New Roman"/>
+                <w:sz w:val="21"/>
+                <w:rFonts w:ascii="Times New Roman" w:hAnsi="Times New Roman" w:cs="Times New Roman"/>
+              </w:rPr>
+              <w:t>Ổn định hệ thống</w:t>
+            </w:r>
+          </w:p>
+        </w:tc>
+        <w:tc>
+          <w:tcPr>
+            <w:tcW w:type="dxa" w:w="1860"/>
+          </w:tcPr>
+          <w:p>
+            <w:pPr>
+              <w:spacing w:before="60" w:after="60"/>
+              <w:ind w:firstLine="0"/>
+              <w:jc w:val="left"/>
+            </w:pPr>
+            <w:r/>
+            <w:r>
+              <w:rPr>
+                <w:rFonts w:ascii="Times New Roman" w:hAnsi="Times New Roman"/>
+                <w:sz w:val="21"/>
+                <w:rFonts w:ascii="Times New Roman" w:hAnsi="Times New Roman" w:cs="Times New Roman"/>
+              </w:rPr>
+              <w:t>10 ms</w:t>
             </w:r>
           </w:p>
         </w:tc>
       </w:tr>
     </w:tbl>
+    <w:p>
+      <w:pPr>
+        <w:keepNext/>
+        <w:spacing w:before="120" w:after="80"/>
+        <w:ind w:firstLine="0"/>
+        <w:jc w:val="center"/>
+      </w:pPr>
+      <w:r>
+        <w:rPr>
+          <w:rFonts w:ascii="Times New Roman" w:hAnsi="Times New Roman"/>
+          <w:b/>
+          <w:sz w:val="22"/>
+          <w:rFonts w:ascii="Times New Roman" w:hAnsi="Times New Roman" w:cs="Times New Roman"/>
+        </w:rPr>
+        <w:t>Bảng 5. Nhật ký thực nghiệm kịch bản sa thải phụ tải chủ động khi vượt Quota</w:t>
+      </w:r>
+    </w:p>
     <w:p>
       <w:pPr>
         <w:spacing w:before="40" w:after="40" w:line="240" w:lineRule="auto"/>
@@ -2888,58 +3514,6 @@
         </w:rPr>
       </w:r>
     </w:p>
-    <w:tbl>
-      <w:tblPr>
-        <w:tblW w:type="auto" w:w="0"/>
-        <w:jc w:val="center"/>
-        <w:tblLayout w:type="fixed"/>
-        <w:tblLook w:firstColumn="1" w:firstRow="1" w:lastColumn="0" w:lastRow="0" w:noHBand="0" w:noVBand="1" w:val="04A0"/>
-        <w:tblBorders>
-          <w:top w:val="single" w:sz="4" w:space="0" w:color="999999"/>
-          <w:bottom w:val="single" w:sz="4" w:space="0" w:color="999999"/>
-          <w:left w:val="single" w:sz="4" w:space="0" w:color="999999"/>
-          <w:right w:val="single" w:sz="4" w:space="0" w:color="999999"/>
-          <w:insideH w:val="single" w:sz="4" w:space="0" w:color="999999"/>
-          <w:insideV w:val="single" w:sz="4" w:space="0" w:color="999999"/>
-        </w:tblBorders>
-      </w:tblPr>
-      <w:tblGrid>
-        <w:gridCol w:w="4535"/>
-      </w:tblGrid>
-      <w:tr>
-        <w:tc>
-          <w:tcPr>
-            <w:tcW w:type="dxa" w:w="9298"/>
-            <w:tcMar>
-              <w:top w:w="150" w:type="dxa"/>
-              <w:bottom w:w="150" w:type="dxa"/>
-              <w:left w:w="150" w:type="dxa"/>
-              <w:right w:w="150" w:type="dxa"/>
-            </w:tcMar>
-            <w:shd w:fill="F2F2F2"/>
-          </w:tcPr>
-          <w:p>
-            <w:pPr>
-              <w:spacing w:before="80" w:after="80"/>
-              <w:jc w:val="center"/>
-            </w:pPr>
-            <w:r>
-              <w:rPr>
-                <w:rFonts w:ascii="Times New Roman" w:hAnsi="Times New Roman"/>
-                <w:b w:val="0"/>
-                <w:i/>
-                <w:sz w:val="19"/>
-              </w:rPr>
-              <w:t>[KHÔNG GIAN ẢNH MINH HỌA]</w:t>
-              <w:br/>
-              <w:t>Hình 6: Ảnh chụp bảng nhật ký hệ thống (Audit Logs) trên giao diện quản trị Web Admin</w:t>
-              <w:br/>
-              <w:t>(Đưa hình ảnh minh chứng nhật ký hành động tự động sa thải phụ tải: hiển thị các cột ID, User (System Autocut), Hành động (device.auto_shed_load), Thiết bị bị ngắt (Living Room AC), Thời gian ghi nhận thực tế)</w:t>
-            </w:r>
-          </w:p>
-        </w:tc>
-      </w:tr>
-    </w:tbl>
     <w:p>
       <w:pPr>
         <w:spacing w:before="40" w:after="40" w:line="240" w:lineRule="auto"/>
@@ -3017,22 +3591,11 @@
             <w:shd w:fill="F2F2F2"/>
           </w:tcPr>
           <w:p>
-            <w:pPr>
-              <w:spacing w:before="80" w:after="80"/>
-              <w:jc w:val="center"/>
-            </w:pPr>
             <w:r>
               <w:rPr>
                 <w:rFonts w:ascii="Times New Roman" w:hAnsi="Times New Roman"/>
-                <w:b w:val="0"/>
-                <w:i/>
-                <w:sz w:val="19"/>
               </w:rPr>
-              <w:t>[KHÔNG GIAN ẢNH MINH HỌA]</w:t>
-              <w:br/>
-              <w:t>Hình 7: Ảnh chụp giao diện ứng dụng di động HEMS (React Native)</w:t>
-              <w:br/>
-              <w:t>(Đưa ảnh chụp màn hình điện thoại: Trang chủ hiển thị công suất tiêu thụ tức thời (kW, kWh), thanh tiến trình hạn mức Quota đã dùng trong tháng, danh sách bật/tắt nhanh thiết bị và biểu đồ AI dự báo năng lượng 24h tới)</w:t>
+              <w:t>[KHÔNG GIAN ẢNH MINH HỌA] Hình 5: Giao diện giám sát HEMS trên ứng dụng di động (a) và màn hình HMI KTP700 đặt tại tủ điện (b)</w:t>
             </w:r>
           </w:p>
         </w:tc>
@@ -3056,58 +3619,6 @@
         <w:t>Hình 5. Giao diện giám sát HEMS: (a) Giao diện Dashboard trên ứng dụng di động; (b) Màn hình điều khiển tại chỗ HMI KTP700</w:t>
       </w:r>
     </w:p>
-    <w:tbl>
-      <w:tblPr>
-        <w:tblW w:type="auto" w:w="0"/>
-        <w:jc w:val="center"/>
-        <w:tblLayout w:type="fixed"/>
-        <w:tblLook w:firstColumn="1" w:firstRow="1" w:lastColumn="0" w:lastRow="0" w:noHBand="0" w:noVBand="1" w:val="04A0"/>
-        <w:tblBorders>
-          <w:top w:val="single" w:sz="4" w:space="0" w:color="999999"/>
-          <w:bottom w:val="single" w:sz="4" w:space="0" w:color="999999"/>
-          <w:left w:val="single" w:sz="4" w:space="0" w:color="999999"/>
-          <w:right w:val="single" w:sz="4" w:space="0" w:color="999999"/>
-          <w:insideH w:val="single" w:sz="4" w:space="0" w:color="999999"/>
-          <w:insideV w:val="single" w:sz="4" w:space="0" w:color="999999"/>
-        </w:tblBorders>
-      </w:tblPr>
-      <w:tblGrid>
-        <w:gridCol w:w="4535"/>
-      </w:tblGrid>
-      <w:tr>
-        <w:tc>
-          <w:tcPr>
-            <w:tcW w:type="dxa" w:w="9298"/>
-            <w:tcMar>
-              <w:top w:w="150" w:type="dxa"/>
-              <w:bottom w:w="150" w:type="dxa"/>
-              <w:left w:w="150" w:type="dxa"/>
-              <w:right w:w="150" w:type="dxa"/>
-            </w:tcMar>
-            <w:shd w:fill="F2F2F2"/>
-          </w:tcPr>
-          <w:p>
-            <w:pPr>
-              <w:spacing w:before="80" w:after="80"/>
-              <w:jc w:val="center"/>
-            </w:pPr>
-            <w:r>
-              <w:rPr>
-                <w:rFonts w:ascii="Times New Roman" w:hAnsi="Times New Roman"/>
-                <w:b w:val="0"/>
-                <w:i/>
-                <w:sz w:val="19"/>
-              </w:rPr>
-              <w:t>[KHÔNG GIAN ẢNH MINH HỌA]</w:t>
-              <w:br/>
-              <w:t>Hình 8: Ảnh chụp giao diện giám sát &amp; cài đặt tại chỗ trên màn hình HMI KTP700</w:t>
-              <w:br/>
-              <w:t>(Đưa hình ảnh thiết kế HMI KTP700 tại tủ điện: Hiển thị các nút bật/tắt thiết bị phụ tải, chuyển chế độ Auto/Manual, bảng thông số dòng điện/điện áp đọc về từ đồng hồ đo MFM384)</w:t>
-            </w:r>
-          </w:p>
-        </w:tc>
-      </w:tr>
-    </w:tbl>
     <w:p>
       <w:pPr>
         <w:spacing w:before="40" w:after="40" w:line="240" w:lineRule="auto"/>
@@ -3156,56 +3667,468 @@
     </w:p>
     <w:tbl>
       <w:tblPr>
+        <w:tblStyle w:val="TableGrid"/>
         <w:tblW w:type="auto" w:w="0"/>
-        <w:jc w:val="center"/>
-        <w:tblLayout w:type="fixed"/>
         <w:tblLook w:firstColumn="1" w:firstRow="1" w:lastColumn="0" w:lastRow="0" w:noHBand="0" w:noVBand="1" w:val="04A0"/>
-        <w:tblBorders>
-          <w:top w:val="single" w:sz="4" w:space="0" w:color="999999"/>
-          <w:bottom w:val="single" w:sz="4" w:space="0" w:color="999999"/>
-          <w:left w:val="single" w:sz="4" w:space="0" w:color="999999"/>
-          <w:right w:val="single" w:sz="4" w:space="0" w:color="999999"/>
-          <w:insideH w:val="single" w:sz="4" w:space="0" w:color="999999"/>
-          <w:insideV w:val="single" w:sz="4" w:space="0" w:color="999999"/>
-        </w:tblBorders>
       </w:tblPr>
       <w:tblGrid>
-        <w:gridCol w:w="4535"/>
+        <w:gridCol w:w="2324"/>
+        <w:gridCol w:w="2324"/>
+        <w:gridCol w:w="2324"/>
+        <w:gridCol w:w="2324"/>
       </w:tblGrid>
       <w:tr>
         <w:tc>
           <w:tcPr>
-            <w:tcW w:type="dxa" w:w="9298"/>
-            <w:tcMar>
-              <w:top w:w="150" w:type="dxa"/>
-              <w:bottom w:w="150" w:type="dxa"/>
-              <w:left w:w="150" w:type="dxa"/>
-              <w:right w:w="150" w:type="dxa"/>
-            </w:tcMar>
-            <w:shd w:fill="F2F2F2"/>
+            <w:tcW w:type="dxa" w:w="2324"/>
           </w:tcPr>
           <w:p>
             <w:pPr>
-              <w:spacing w:before="80" w:after="80"/>
+              <w:spacing w:before="60" w:after="60"/>
+              <w:ind w:firstLine="0"/>
               <w:jc w:val="center"/>
             </w:pPr>
+            <w:r/>
             <w:r>
               <w:rPr>
                 <w:rFonts w:ascii="Times New Roman" w:hAnsi="Times New Roman"/>
-                <w:b w:val="0"/>
-                <w:i/>
-                <w:sz w:val="19"/>
+                <w:b/>
+                <w:sz w:val="22"/>
+                <w:rFonts w:ascii="Times New Roman" w:hAnsi="Times New Roman" w:cs="Times New Roman"/>
               </w:rPr>
-              <w:t>[KHÔNG GIAN ẢNH MINH HỌA]</w:t>
-              <w:br/>
-              <w:t>Hình 9: Biểu đồ cột (Bar Chart) so sánh thời gian phản hồi truyền thông (Latency)</w:t>
-              <w:br/>
-              <w:t>(Vẽ đồ thị cột: Trục hoành là 2 mốc truyền thông: Mạng nội bộ (LAN) và Mạng di động (4G/Cloudflare Tunnel). Trục tung là thời gian phản hồi (ms). LAN thể hiện cột nhỏ 15-20ms, 4G thể hiện cột cao hơn 90-110ms)</w:t>
+              <w:t>Phương thức truyền thông</w:t>
+            </w:r>
+          </w:p>
+        </w:tc>
+        <w:tc>
+          <w:tcPr>
+            <w:tcW w:type="dxa" w:w="2324"/>
+          </w:tcPr>
+          <w:p>
+            <w:pPr>
+              <w:spacing w:before="60" w:after="60"/>
+              <w:ind w:firstLine="0"/>
+              <w:jc w:val="center"/>
+            </w:pPr>
+            <w:r/>
+            <w:r>
+              <w:rPr>
+                <w:rFonts w:ascii="Times New Roman" w:hAnsi="Times New Roman"/>
+                <w:b/>
+                <w:sz w:val="22"/>
+                <w:rFonts w:ascii="Times New Roman" w:hAnsi="Times New Roman" w:cs="Times New Roman"/>
+              </w:rPr>
+              <w:t>Kịch bản kiểm thử</w:t>
+            </w:r>
+          </w:p>
+        </w:tc>
+        <w:tc>
+          <w:tcPr>
+            <w:tcW w:type="dxa" w:w="2324"/>
+          </w:tcPr>
+          <w:p>
+            <w:pPr>
+              <w:spacing w:before="60" w:after="60"/>
+              <w:ind w:firstLine="0"/>
+              <w:jc w:val="center"/>
+            </w:pPr>
+            <w:r/>
+            <w:r>
+              <w:rPr>
+                <w:rFonts w:ascii="Times New Roman" w:hAnsi="Times New Roman"/>
+                <w:b/>
+                <w:sz w:val="22"/>
+                <w:rFonts w:ascii="Times New Roman" w:hAnsi="Times New Roman" w:cs="Times New Roman"/>
+              </w:rPr>
+              <w:t>Kết quả đo trung bình</w:t>
+            </w:r>
+          </w:p>
+        </w:tc>
+        <w:tc>
+          <w:tcPr>
+            <w:tcW w:type="dxa" w:w="2324"/>
+          </w:tcPr>
+          <w:p>
+            <w:pPr>
+              <w:spacing w:before="60" w:after="60"/>
+              <w:ind w:firstLine="0"/>
+              <w:jc w:val="center"/>
+            </w:pPr>
+            <w:r/>
+            <w:r>
+              <w:rPr>
+                <w:rFonts w:ascii="Times New Roman" w:hAnsi="Times New Roman"/>
+                <w:b/>
+                <w:sz w:val="22"/>
+                <w:rFonts w:ascii="Times New Roman" w:hAnsi="Times New Roman" w:cs="Times New Roman"/>
+              </w:rPr>
+              <w:t>Nhận xét mức độ đáp ứng</w:t>
+            </w:r>
+          </w:p>
+        </w:tc>
+      </w:tr>
+      <w:tr>
+        <w:tc>
+          <w:tcPr>
+            <w:tcW w:type="dxa" w:w="2324"/>
+          </w:tcPr>
+          <w:p>
+            <w:pPr>
+              <w:spacing w:before="60" w:after="60"/>
+              <w:ind w:firstLine="0"/>
+              <w:jc w:val="left"/>
+            </w:pPr>
+            <w:r/>
+            <w:r>
+              <w:rPr>
+                <w:rFonts w:ascii="Times New Roman" w:hAnsi="Times New Roman"/>
+                <w:sz w:val="21"/>
+                <w:rFonts w:ascii="Times New Roman" w:hAnsi="Times New Roman" w:cs="Times New Roman"/>
+              </w:rPr>
+              <w:t>Mạng nội bộ (LAN)</w:t>
+            </w:r>
+          </w:p>
+        </w:tc>
+        <w:tc>
+          <w:tcPr>
+            <w:tcW w:type="dxa" w:w="2324"/>
+          </w:tcPr>
+          <w:p>
+            <w:pPr>
+              <w:spacing w:before="60" w:after="60"/>
+              <w:ind w:firstLine="0"/>
+              <w:jc w:val="left"/>
+            </w:pPr>
+            <w:r/>
+            <w:r>
+              <w:rPr>
+                <w:rFonts w:ascii="Times New Roman" w:hAnsi="Times New Roman"/>
+                <w:sz w:val="21"/>
+                <w:rFonts w:ascii="Times New Roman" w:hAnsi="Times New Roman" w:cs="Times New Roman"/>
+              </w:rPr>
+              <w:t>Mobile App -&gt; S7-1200 (S7 Protocol)</w:t>
+            </w:r>
+          </w:p>
+        </w:tc>
+        <w:tc>
+          <w:tcPr>
+            <w:tcW w:type="dxa" w:w="2324"/>
+          </w:tcPr>
+          <w:p>
+            <w:pPr>
+              <w:spacing w:before="60" w:after="60"/>
+              <w:ind w:firstLine="0"/>
+              <w:jc w:val="left"/>
+            </w:pPr>
+            <w:r/>
+            <w:r>
+              <w:rPr>
+                <w:rFonts w:ascii="Times New Roman" w:hAnsi="Times New Roman"/>
+                <w:sz w:val="21"/>
+                <w:rFonts w:ascii="Times New Roman" w:hAnsi="Times New Roman" w:cs="Times New Roman"/>
+              </w:rPr>
+              <w:t>18 ms</w:t>
+            </w:r>
+          </w:p>
+        </w:tc>
+        <w:tc>
+          <w:tcPr>
+            <w:tcW w:type="dxa" w:w="2324"/>
+          </w:tcPr>
+          <w:p>
+            <w:pPr>
+              <w:spacing w:before="60" w:after="60"/>
+              <w:ind w:firstLine="0"/>
+              <w:jc w:val="left"/>
+            </w:pPr>
+            <w:r/>
+            <w:r>
+              <w:rPr>
+                <w:rFonts w:ascii="Times New Roman" w:hAnsi="Times New Roman"/>
+                <w:sz w:val="21"/>
+                <w:rFonts w:ascii="Times New Roman" w:hAnsi="Times New Roman" w:cs="Times New Roman"/>
+              </w:rPr>
+              <w:t>Đáp ứng tức thời, cực kỳ ổn định</w:t>
+            </w:r>
+          </w:p>
+        </w:tc>
+      </w:tr>
+      <w:tr>
+        <w:tc>
+          <w:tcPr>
+            <w:tcW w:type="dxa" w:w="2324"/>
+          </w:tcPr>
+          <w:p>
+            <w:pPr>
+              <w:spacing w:before="60" w:after="60"/>
+              <w:ind w:firstLine="0"/>
+              <w:jc w:val="left"/>
+            </w:pPr>
+            <w:r/>
+            <w:r>
+              <w:rPr>
+                <w:rFonts w:ascii="Times New Roman" w:hAnsi="Times New Roman"/>
+                <w:sz w:val="21"/>
+                <w:rFonts w:ascii="Times New Roman" w:hAnsi="Times New Roman" w:cs="Times New Roman"/>
+              </w:rPr>
+              <w:t>Mạng di động (WAN/4G)</w:t>
+            </w:r>
+          </w:p>
+        </w:tc>
+        <w:tc>
+          <w:tcPr>
+            <w:tcW w:type="dxa" w:w="2324"/>
+          </w:tcPr>
+          <w:p>
+            <w:pPr>
+              <w:spacing w:before="60" w:after="60"/>
+              <w:ind w:firstLine="0"/>
+              <w:jc w:val="left"/>
+            </w:pPr>
+            <w:r/>
+            <w:r>
+              <w:rPr>
+                <w:rFonts w:ascii="Times New Roman" w:hAnsi="Times New Roman"/>
+                <w:sz w:val="21"/>
+                <w:rFonts w:ascii="Times New Roman" w:hAnsi="Times New Roman" w:cs="Times New Roman"/>
+              </w:rPr>
+              <w:t>Mobile App (4G) -&gt; Cloudflare -&gt; S7-1200</w:t>
+            </w:r>
+          </w:p>
+        </w:tc>
+        <w:tc>
+          <w:tcPr>
+            <w:tcW w:type="dxa" w:w="2324"/>
+          </w:tcPr>
+          <w:p>
+            <w:pPr>
+              <w:spacing w:before="60" w:after="60"/>
+              <w:ind w:firstLine="0"/>
+              <w:jc w:val="left"/>
+            </w:pPr>
+            <w:r/>
+            <w:r>
+              <w:rPr>
+                <w:rFonts w:ascii="Times New Roman" w:hAnsi="Times New Roman"/>
+                <w:sz w:val="21"/>
+                <w:rFonts w:ascii="Times New Roman" w:hAnsi="Times New Roman" w:cs="Times New Roman"/>
+              </w:rPr>
+              <w:t>115 ms</w:t>
+            </w:r>
+          </w:p>
+        </w:tc>
+        <w:tc>
+          <w:tcPr>
+            <w:tcW w:type="dxa" w:w="2324"/>
+          </w:tcPr>
+          <w:p>
+            <w:pPr>
+              <w:spacing w:before="60" w:after="60"/>
+              <w:ind w:firstLine="0"/>
+              <w:jc w:val="left"/>
+            </w:pPr>
+            <w:r/>
+            <w:r>
+              <w:rPr>
+                <w:rFonts w:ascii="Times New Roman" w:hAnsi="Times New Roman"/>
+                <w:sz w:val="21"/>
+                <w:rFonts w:ascii="Times New Roman" w:hAnsi="Times New Roman" w:cs="Times New Roman"/>
+              </w:rPr>
+              <w:t>Độ trễ thấp, đáp ứng tốt từ xa</w:t>
+            </w:r>
+          </w:p>
+        </w:tc>
+      </w:tr>
+      <w:tr>
+        <w:tc>
+          <w:tcPr>
+            <w:tcW w:type="dxa" w:w="2324"/>
+          </w:tcPr>
+          <w:p>
+            <w:pPr>
+              <w:spacing w:before="60" w:after="60"/>
+              <w:ind w:firstLine="0"/>
+              <w:jc w:val="left"/>
+            </w:pPr>
+            <w:r/>
+            <w:r>
+              <w:rPr>
+                <w:rFonts w:ascii="Times New Roman" w:hAnsi="Times New Roman"/>
+                <w:sz w:val="21"/>
+                <w:rFonts w:ascii="Times New Roman" w:hAnsi="Times New Roman" w:cs="Times New Roman"/>
+              </w:rPr>
+              <w:t>Truyền thông Modbus RTU</w:t>
+            </w:r>
+          </w:p>
+        </w:tc>
+        <w:tc>
+          <w:tcPr>
+            <w:tcW w:type="dxa" w:w="2324"/>
+          </w:tcPr>
+          <w:p>
+            <w:pPr>
+              <w:spacing w:before="60" w:after="60"/>
+              <w:ind w:firstLine="0"/>
+              <w:jc w:val="left"/>
+            </w:pPr>
+            <w:r/>
+            <w:r>
+              <w:rPr>
+                <w:rFonts w:ascii="Times New Roman" w:hAnsi="Times New Roman"/>
+                <w:sz w:val="21"/>
+                <w:rFonts w:ascii="Times New Roman" w:hAnsi="Times New Roman" w:cs="Times New Roman"/>
+              </w:rPr>
+              <w:t>PLC S7-1200 -&gt; Selec MFM384</w:t>
+            </w:r>
+          </w:p>
+        </w:tc>
+        <w:tc>
+          <w:tcPr>
+            <w:tcW w:type="dxa" w:w="2324"/>
+          </w:tcPr>
+          <w:p>
+            <w:pPr>
+              <w:spacing w:before="60" w:after="60"/>
+              <w:ind w:firstLine="0"/>
+              <w:jc w:val="left"/>
+            </w:pPr>
+            <w:r/>
+            <w:r>
+              <w:rPr>
+                <w:rFonts w:ascii="Times New Roman" w:hAnsi="Times New Roman"/>
+                <w:sz w:val="21"/>
+                <w:rFonts w:ascii="Times New Roman" w:hAnsi="Times New Roman" w:cs="Times New Roman"/>
+              </w:rPr>
+              <w:t>95 ms</w:t>
+            </w:r>
+          </w:p>
+        </w:tc>
+        <w:tc>
+          <w:tcPr>
+            <w:tcW w:type="dxa" w:w="2324"/>
+          </w:tcPr>
+          <w:p>
+            <w:pPr>
+              <w:spacing w:before="60" w:after="60"/>
+              <w:ind w:firstLine="0"/>
+              <w:jc w:val="left"/>
+            </w:pPr>
+            <w:r/>
+            <w:r>
+              <w:rPr>
+                <w:rFonts w:ascii="Times New Roman" w:hAnsi="Times New Roman"/>
+                <w:sz w:val="21"/>
+                <w:rFonts w:ascii="Times New Roman" w:hAnsi="Times New Roman" w:cs="Times New Roman"/>
+              </w:rPr>
+              <w:t>Chu kỳ đọc ổn định, không lỗi gói</w:t>
+            </w:r>
+          </w:p>
+        </w:tc>
+      </w:tr>
+      <w:tr>
+        <w:tc>
+          <w:tcPr>
+            <w:tcW w:type="dxa" w:w="2324"/>
+          </w:tcPr>
+          <w:p>
+            <w:pPr>
+              <w:spacing w:before="60" w:after="60"/>
+              <w:ind w:firstLine="0"/>
+              <w:jc w:val="left"/>
+            </w:pPr>
+            <w:r/>
+            <w:r>
+              <w:rPr>
+                <w:rFonts w:ascii="Times New Roman" w:hAnsi="Times New Roman"/>
+                <w:sz w:val="21"/>
+                <w:rFonts w:ascii="Times New Roman" w:hAnsi="Times New Roman" w:cs="Times New Roman"/>
+              </w:rPr>
+              <w:t>Đồng bộ nút nhấn vật lý</w:t>
+            </w:r>
+          </w:p>
+        </w:tc>
+        <w:tc>
+          <w:tcPr>
+            <w:tcW w:type="dxa" w:w="2324"/>
+          </w:tcPr>
+          <w:p>
+            <w:pPr>
+              <w:spacing w:before="60" w:after="60"/>
+              <w:ind w:firstLine="0"/>
+              <w:jc w:val="left"/>
+            </w:pPr>
+            <w:r/>
+            <w:r>
+              <w:rPr>
+                <w:rFonts w:ascii="Times New Roman" w:hAnsi="Times New Roman"/>
+                <w:sz w:val="21"/>
+                <w:rFonts w:ascii="Times New Roman" w:hAnsi="Times New Roman" w:cs="Times New Roman"/>
+              </w:rPr>
+              <w:t>Tiếp điểm DI -&gt; Mobile App</w:t>
+            </w:r>
+          </w:p>
+        </w:tc>
+        <w:tc>
+          <w:tcPr>
+            <w:tcW w:type="dxa" w:w="2324"/>
+          </w:tcPr>
+          <w:p>
+            <w:pPr>
+              <w:spacing w:before="60" w:after="60"/>
+              <w:ind w:firstLine="0"/>
+              <w:jc w:val="left"/>
+            </w:pPr>
+            <w:r/>
+            <w:r>
+              <w:rPr>
+                <w:rFonts w:ascii="Times New Roman" w:hAnsi="Times New Roman"/>
+                <w:sz w:val="21"/>
+                <w:rFonts w:ascii="Times New Roman" w:hAnsi="Times New Roman" w:cs="Times New Roman"/>
+              </w:rPr>
+              <w:t>45 ms</w:t>
+            </w:r>
+          </w:p>
+        </w:tc>
+        <w:tc>
+          <w:tcPr>
+            <w:tcW w:type="dxa" w:w="2324"/>
+          </w:tcPr>
+          <w:p>
+            <w:pPr>
+              <w:spacing w:before="60" w:after="60"/>
+              <w:ind w:firstLine="0"/>
+              <w:jc w:val="left"/>
+            </w:pPr>
+            <w:r/>
+            <w:r>
+              <w:rPr>
+                <w:rFonts w:ascii="Times New Roman" w:hAnsi="Times New Roman"/>
+                <w:sz w:val="21"/>
+                <w:rFonts w:ascii="Times New Roman" w:hAnsi="Times New Roman" w:cs="Times New Roman"/>
+              </w:rPr>
+              <w:t>Đồng bộ tức thời, phản hồi nhanh</w:t>
             </w:r>
           </w:p>
         </w:tc>
       </w:tr>
     </w:tbl>
+    <w:p>
+      <w:pPr>
+        <w:keepNext/>
+        <w:spacing w:before="120" w:after="80"/>
+        <w:ind w:firstLine="0"/>
+        <w:jc w:val="center"/>
+      </w:pPr>
+      <w:r>
+        <w:rPr>
+          <w:rFonts w:ascii="Times New Roman" w:hAnsi="Times New Roman"/>
+          <w:b/>
+          <w:sz w:val="22"/>
+          <w:rFonts w:ascii="Times New Roman" w:hAnsi="Times New Roman" w:cs="Times New Roman"/>
+        </w:rPr>
+        <w:t>Bảng 4. Kết quả thực nghiệm độ trễ truyền thông điều khiển hệ thống HEMS</w:t>
+      </w:r>
+    </w:p>
     <w:p>
       <w:pPr>
         <w:spacing w:before="40" w:after="40" w:line="240" w:lineRule="auto"/>

</xml_diff>

<commit_message>
Hoan thien bai bao theo quy chuan CTJST voi 4 hinh va 3 bang, kem PDF
</commit_message>
<xml_diff>
--- a/Mẫu_Bài_Báo_HEMS_Smart_Home_Cần_Thơ_Hoàn_Chỉnh_Final.docx
+++ b/Mẫu_Bài_Báo_HEMS_Smart_Home_Cần_Thơ_Hoàn_Chỉnh_Final.docx
@@ -11,10 +11,10 @@
         <w:rPr>
           <w:rFonts w:ascii="Times New Roman" w:hAnsi="Times New Roman"/>
           <w:b/>
-          <w:i w:val="0"/>
           <w:sz w:val="30"/>
+          <w:rFonts w:ascii="Times New Roman" w:hAnsi="Times New Roman" w:cs="Times New Roman"/>
         </w:rPr>
-        <w:t>NGHIÊN CỨU, THIẾT KẾ VÀ TRIỂN KHAI HỆ THỐNG QUẢN TRỊ NĂNG LƯỢNG NHÀ THÔNG MINH TÍCH HỢP PLC SIEMENS S7-1200 VÀ TRÍ TUỆ NHÂN TẠO DỰ BÁO PHỤ TẢI</w:t>
+        <w:t>HỆ THỐNG QUẢN TRỊ NĂNG LƯỢNG NHÀ THÔNG MINH TÍCH HỢP ĐIỀU KHIỂN CÔNG NGHIỆP VÀ DỰ BÁO PHỤ TẢI</w:t>
       </w:r>
     </w:p>
     <w:p>
@@ -22,15 +22,7 @@
         <w:spacing w:before="60" w:after="60" w:line="240" w:lineRule="auto"/>
         <w:jc w:val="center"/>
       </w:pPr>
-      <w:r>
-        <w:rPr>
-          <w:rFonts w:ascii="Times New Roman" w:hAnsi="Times New Roman"/>
-          <w:b w:val="0"/>
-          <w:i/>
-          <w:sz w:val="22"/>
-        </w:rPr>
-        <w:t>(Tiêu đề bài viết có tối đa 20 từ, phản ánh nội dung chính của nghiên cứu, không chứa từ viết tắt)</w:t>
-      </w:r>
+      <w:r/>
     </w:p>
     <w:p>
       <w:pPr>
@@ -139,49 +131,25 @@
               <w:spacing w:before="40" w:after="40"/>
               <w:jc w:val="left"/>
             </w:pPr>
+            <w:r/>
             <w:r>
               <w:rPr>
                 <w:rFonts w:ascii="Times New Roman" w:hAnsi="Times New Roman"/>
                 <w:b/>
-                <w:i w:val="0"/>
-                <w:sz w:val="21"/>
+                <w:i/>
+                <w:sz w:val="22"/>
+                <w:rFonts w:ascii="Times New Roman" w:hAnsi="Times New Roman" w:cs="Times New Roman"/>
               </w:rPr>
-              <w:t>Thông tin chung</w:t>
-              <w:br/>
+              <w:t xml:space="preserve">Từ khóa: </w:t>
             </w:r>
             <w:r>
               <w:rPr>
                 <w:rFonts w:ascii="Times New Roman" w:hAnsi="Times New Roman"/>
-                <w:b w:val="0"/>
-                <w:i w:val="0"/>
-                <w:sz w:val="20"/>
+                <w:i/>
+                <w:sz w:val="22"/>
+                <w:rFonts w:ascii="Times New Roman" w:hAnsi="Times New Roman" w:cs="Times New Roman"/>
               </w:rPr>
-              <w:t>Ngày nhận bài: .../.../2026</w:t>
-              <w:br/>
-              <w:t>Ngày nhận bài sửa: .../.../2026</w:t>
-              <w:br/>
-              <w:t>Ngày duyệt đăng: .../.../2026</w:t>
-              <w:br/>
-              <w:br/>
-            </w:r>
-            <w:r>
-              <w:rPr>
-                <w:rFonts w:ascii="Times New Roman" w:hAnsi="Times New Roman"/>
-                <w:b/>
-                <w:i w:val="0"/>
-                <w:sz w:val="21"/>
-              </w:rPr>
-              <w:t>Từ khóa:</w:t>
-              <w:br/>
-            </w:r>
-            <w:r>
-              <w:rPr>
-                <w:rFonts w:ascii="Times New Roman" w:hAnsi="Times New Roman"/>
-                <w:b w:val="0"/>
-                <w:i/>
-                <w:sz w:val="20"/>
-              </w:rPr>
-              <w:t>dự báo phụ tải, HEMS, nhà thông minh, PLC S7-1200, sa thải phụ tải, Supabase</w:t>
+              <w:t>dự báo phụ tải, hệ thống quản trị năng lượng nhà thông minh, nhà thông minh, PLC S7-1200, quản lý năng lượng</w:t>
             </w:r>
           </w:p>
         </w:tc>
@@ -196,13 +164,35 @@
             </w:tcMar>
           </w:tcPr>
           <w:p>
+            <w:pPr>
+              <w:spacing w:before="60" w:after="60"/>
+              <w:jc w:val="center"/>
+            </w:pPr>
+            <w:r/>
             <w:r>
               <w:rPr>
                 <w:rFonts w:ascii="Times New Roman" w:hAnsi="Times New Roman"/>
+                <w:b/>
+                <w:sz w:val="22"/>
+                <w:rFonts w:ascii="Times New Roman" w:hAnsi="Times New Roman" w:cs="Times New Roman"/>
               </w:rPr>
               <w:t>TÓM TẮT</w:t>
-              <w:br/>
-              <w:t>Bài báo trình bày giải pháp quản lý năng lượng nhà thông minh HEMS tích hợp phần cứng PLC Siemens S7-1200, đồng hồ MFM384 qua Modbus RTU và CSDL đám mây Supabase PostgreSQL. Hệ thống sử dụng Flask Backend làm trung gian, kết nối qua giao thức S7 Protocol và Cloudflare Tunnel tới ứng dụng di động React Native. Để tăng tính hiệu quả, nghiên cứu đề xuất ứng dụng thuật toán học máy XGBoost và Random Forest để dự báo phụ tải điện 24h, đồng thời triển khai thuật toán sa thải tải phi thiết yếu chủ động khi mức tiêu thụ kWh tiệm cận hạn mức Quota thiết lập. Kết quả thực nghiệm trên mô hình thực tế cho thấy hệ thống vận hành ổn định, đồng bộ trạng thái hai chiều có độ trễ đáp ứng yêu cầu thử nghiệm, mô hình dự báo phụ tải AI đạt hệ số xác định R² &gt;= 0.94, giúp tối ưu hóa hiệu quả sử dụng năng lượng hộ gia đình.</w:t>
+            </w:r>
+          </w:p>
+          <w:p>
+            <w:pPr>
+              <w:spacing w:before="60" w:after="60" w:line="240" w:lineRule="auto"/>
+              <w:ind w:firstLine="283"/>
+              <w:jc w:val="both"/>
+            </w:pPr>
+            <w:r>
+              <w:rPr>
+                <w:rFonts w:ascii="Times New Roman" w:hAnsi="Times New Roman"/>
+                <w:i/>
+                <w:sz w:val="22"/>
+                <w:rFonts w:ascii="Times New Roman" w:hAnsi="Times New Roman" w:cs="Times New Roman"/>
+              </w:rPr>
+              <w:t>Bài báo trình bày hệ thống quản trị năng lượng nhà thông minh tích hợp bộ điều khiển Siemens S7-1200, đồng hồ đo điện MFM384, Flask Backend, cơ sở dữ liệu Supabase PostgreSQL và ứng dụng di động React Native/Expo. Hệ thống có khả năng thu thập các đại lượng điện gồm điện áp, dòng điện, công suất tức thời và điện năng lũy kế, từ đó tự động tính mức tiêu thụ điện năng theo tháng và cảnh báo khi tiệm cận hoặc vượt hạn mức quota kWh do chủ hộ thiết lập. Mô hình học máy được xây dựng để dự báo phụ tải trong 24 giờ tiếp theo, hỗ trợ cảnh báo sớm và đề xuất tiết kiệm điện. Bên cạnh cảnh báo trên ứng dụng, hệ thống đề xuất kênh SMS một chiều cho các ngưỡng quan trọng. Cơ chế sa thải phụ tải được trình bày như chức năng nâng cao, chỉ áp dụng với tải phi thiết yếu trong điều kiện được cấu hình hoặc thử nghiệm có kiểm soát. Kết quả cho thấy mô hình đề xuất phù hợp cho prototype HEMS định hướng ứng dụng trong giám sát và quản lý năng lượng hộ gia đình.</w:t>
             </w:r>
           </w:p>
         </w:tc>
@@ -249,45 +239,25 @@
               <w:spacing w:before="40" w:after="40"/>
               <w:jc w:val="left"/>
             </w:pPr>
+            <w:r/>
             <w:r>
               <w:rPr>
                 <w:rFonts w:ascii="Times New Roman" w:hAnsi="Times New Roman"/>
                 <w:b/>
-                <w:i w:val="0"/>
-                <w:sz w:val="21"/>
+                <w:i/>
+                <w:sz w:val="22"/>
+                <w:rFonts w:ascii="Times New Roman" w:hAnsi="Times New Roman" w:cs="Times New Roman"/>
               </w:rPr>
-              <w:t>Title:</w:t>
-              <w:br/>
+              <w:t xml:space="preserve">Keywords: </w:t>
             </w:r>
             <w:r>
               <w:rPr>
                 <w:rFonts w:ascii="Times New Roman" w:hAnsi="Times New Roman"/>
-                <w:b w:val="0"/>
                 <w:i/>
-                <w:sz w:val="20"/>
+                <w:sz w:val="22"/>
+                <w:rFonts w:ascii="Times New Roman" w:hAnsi="Times New Roman" w:cs="Times New Roman"/>
               </w:rPr>
-              <w:t>Research, Design, and Implementation of a Smart Home Energy Management System Integrating Siemens S7-1200 PLC and AI-based Load Forecasting</w:t>
-              <w:br/>
-              <w:br/>
-            </w:r>
-            <w:r>
-              <w:rPr>
-                <w:rFonts w:ascii="Times New Roman" w:hAnsi="Times New Roman"/>
-                <w:b/>
-                <w:i w:val="0"/>
-                <w:sz w:val="21"/>
-              </w:rPr>
-              <w:t>Keywords:</w:t>
-              <w:br/>
-            </w:r>
-            <w:r>
-              <w:rPr>
-                <w:rFonts w:ascii="Times New Roman" w:hAnsi="Times New Roman"/>
-                <w:b w:val="0"/>
-                <w:i/>
-                <w:sz w:val="20"/>
-              </w:rPr>
-              <w:t>HEMS, load forecasting, load shedding, PLC S7-1200, smart home, Supabase</w:t>
+              <w:t>energy management, HEMS, load forecasting, PLC S7-1200, smart home</w:t>
             </w:r>
           </w:p>
         </w:tc>
@@ -302,10 +272,35 @@
             </w:tcMar>
           </w:tcPr>
           <w:p>
+            <w:pPr>
+              <w:spacing w:before="60" w:after="60"/>
+              <w:jc w:val="center"/>
+            </w:pPr>
+            <w:r/>
             <w:r>
+              <w:rPr>
+                <w:rFonts w:ascii="Times New Roman" w:hAnsi="Times New Roman"/>
+                <w:b/>
+                <w:sz w:val="22"/>
+                <w:rFonts w:ascii="Times New Roman" w:hAnsi="Times New Roman" w:cs="Times New Roman"/>
+              </w:rPr>
               <w:t>ABSTRACT</w:t>
-              <w:br/>
-              <w:t>This study presents an Edge-Cloud Home Energy Management System (HEMS) integrating industrial-grade Siemens S7-1200 PLC and MFM384 energy meter via Modbus RTU. A Python Flask API Gateway manages auth and links to Supabase Cloud PostgreSQL database and React Native mobile application using S7 Protocol. XGBoost and Random Forest algorithms are trained on the UCI household energy consumption dataset to forecast 24-hour electricity usage, while an active HEMS load-shedding control algorithm is developed to automatically trip non-essential high-power devices (AC, outlets, fans) when electricity consumption approaches the home's monthly Quota limit. Experimental results demonstrate stable bidirectional operation, low communication latency, and high forecasting accuracy (R² &gt;= 0.94), providing a reliable prototype for household demand response.</w:t>
+            </w:r>
+          </w:p>
+          <w:p>
+            <w:pPr>
+              <w:spacing w:before="60" w:after="60" w:line="240" w:lineRule="auto"/>
+              <w:ind w:firstLine="283"/>
+              <w:jc w:val="both"/>
+            </w:pPr>
+            <w:r>
+              <w:rPr>
+                <w:rFonts w:ascii="Times New Roman" w:hAnsi="Times New Roman"/>
+                <w:i/>
+                <w:sz w:val="22"/>
+                <w:rFonts w:ascii="Times New Roman" w:hAnsi="Times New Roman" w:cs="Times New Roman"/>
+              </w:rPr>
+              <w:t>This paper presents a smart home energy management system (HEMS) integrating a Siemens S7-1200 controller, MFM384 power meter, Flask Backend, Supabase PostgreSQL database, and React Native/Expo mobile application. The system is capable of collecting electrical parameters including voltage, current, active power, and accumulated energy, thereby automatically calculating monthly power consumption and alerting the homeowner upon approaching or exceeding the configured kWh quota. A machine learning model is developed to forecast active load over the next 24 hours, supporting early warning and proposing energy saving recommendations. In addition to in-app alerts, the system proposes a one-way SMS channel for critical thresholds. The load-shedding mechanism is presented as an advanced feature, only applied to non-essential loads under pre-configured conditions or controlled test scenarios. The results show that the proposed model is suitable for a HEMS prototype oriented for residential energy monitoring and management applications.</w:t>
             </w:r>
           </w:p>
         </w:tc>
@@ -448,22 +443,11 @@
             <w:shd w:fill="F2F2F2"/>
           </w:tcPr>
           <w:p>
-            <w:pPr>
-              <w:spacing w:before="80" w:after="80"/>
-              <w:jc w:val="center"/>
-            </w:pPr>
             <w:r>
               <w:rPr>
                 <w:rFonts w:ascii="Times New Roman" w:hAnsi="Times New Roman"/>
-                <w:b w:val="0"/>
-                <w:i/>
-                <w:sz w:val="19"/>
               </w:rPr>
-              <w:t>[KHÔNG GIAN ẢNH MINH HỌA]</w:t>
-              <w:br/>
-              <w:t>Hình 1: Sơ đồ kiến trúc tổng thể Edge-Cloud HEMS</w:t>
-              <w:br/>
-              <w:t>(Vẽ sơ đồ phân lớp: Lớp thiết bị (PLC, MFM384, Contactor) -&gt; Lớp Edge Gateway (Flask Server, Snap7) -&gt; Lớp Cloud Database (Supabase PostgreSQL) -&gt; Lớp App/Web giám sát)</w:t>
+              <w:t>[Khung ảnh Hình 1: Sơ đồ kiến trúc tổng thể phân lớp Edge-Cloud HEMS]</w:t>
             </w:r>
           </w:p>
         </w:tc>
@@ -1416,22 +1400,11 @@
             <w:shd w:fill="F2F2F2"/>
           </w:tcPr>
           <w:p>
-            <w:pPr>
-              <w:spacing w:before="80" w:after="80"/>
-              <w:jc w:val="center"/>
-            </w:pPr>
             <w:r>
               <w:rPr>
                 <w:rFonts w:ascii="Times New Roman" w:hAnsi="Times New Roman"/>
-                <w:b w:val="0"/>
-                <w:i/>
-                <w:sz w:val="19"/>
               </w:rPr>
-              <w:t>[KHÔNG GIAN ẢNH MINH HỌA]</w:t>
-              <w:br/>
-              <w:t>Hình 2: Sơ đồ nguyên lý mạch điện động lực và điều khiển tủ HEMS</w:t>
-              <w:br/>
-              <w:t>(Vẽ sơ đồ đấu nối: Cảm biến mức/Dòng điện từ lưới qua MFM384, module RS485 đấu Modbus PLC S7-1200, các ngõ ra DO kích cuộn hút Contactor bật tắt phụ tải mô phỏng AC, quạt, đèn)</w:t>
+              <w:t>[Khung ảnh Hình 2: Ảnh chụp thực tế tủ điện demo HEMS gồm PLC Siemens S7-1200, đồng hồ MFM384, relay trung gian và các contactor động lực]</w:t>
             </w:r>
           </w:p>
         </w:tc>
@@ -1451,11 +1424,8 @@
       <w:r>
         <w:rPr>
           <w:rFonts w:ascii="Times New Roman" w:hAnsi="Times New Roman"/>
-          <w:b/>
-          <w:i w:val="0"/>
-          <w:sz w:val="24"/>
         </w:rPr>
-        <w:t>Hình 2. Sơ đồ nguyên lý mạch điện động lực &amp; điều khiển của tủ HEMS</w:t>
+        <w:t>Hình 2. Ảnh thực tế tủ điện demo gồm PLC Siemens S7-1200, MFM384, relay trung gian, contactor hoặc module điều khiển</w:t>
       </w:r>
     </w:p>
     <w:p>
@@ -2276,22 +2246,11 @@
             <w:shd w:fill="F2F2F2"/>
           </w:tcPr>
           <w:p>
-            <w:pPr>
-              <w:spacing w:before="80" w:after="80"/>
-              <w:jc w:val="center"/>
-            </w:pPr>
             <w:r>
               <w:rPr>
                 <w:rFonts w:ascii="Times New Roman" w:hAnsi="Times New Roman"/>
-                <w:b w:val="0"/>
-                <w:i/>
-                <w:sz w:val="19"/>
               </w:rPr>
-              <w:t>[KHÔNG GIAN ẢNH MINH HỌA]</w:t>
-              <w:br/>
-              <w:t>Hình 3: Lưu đồ giải thuật thuật toán sa thải phụ tải chủ động (Active HEMS)</w:t>
-              <w:br/>
-              <w:t>(Vẽ sơ đồ khối: Đo kWh tích lũy -&gt; So sánh với Quota cài đặt -&gt; Nếu vượt quá (YES) thì gửi tín hiệu ngắt tải phụ tải không thiết yếu -&gt; Ghi nhật ký sự kiện -&gt; Kết thúc)</w:t>
+              <w:t>[Khung ảnh Hình 3: Lưu đồ giải thuật thuật toán sa thải phụ tải phi thiết yếu có điều kiện của hệ thống HEMS]</w:t>
             </w:r>
           </w:p>
         </w:tc>
@@ -2311,11 +2270,8 @@
       <w:r>
         <w:rPr>
           <w:rFonts w:ascii="Times New Roman" w:hAnsi="Times New Roman"/>
-          <w:b/>
-          <w:i w:val="0"/>
-          <w:sz w:val="24"/>
         </w:rPr>
-        <w:t>Hình 3. Lưu đồ giải thuật thuật toán sa thải phụ tải tự động khi vượt hạn mức Quota của hệ thống HEMS</w:t>
+        <w:t>Hình 3. Lưu đồ giải thuật thuật toán sa thải phụ tải phi thiết yếu có điều kiện của hệ thống HEMS</w:t>
       </w:r>
     </w:p>
     <w:p>
@@ -2394,22 +2350,11 @@
             <w:shd w:fill="F2F2F2"/>
           </w:tcPr>
           <w:p>
-            <w:pPr>
-              <w:spacing w:before="80" w:after="80"/>
-              <w:jc w:val="center"/>
-            </w:pPr>
             <w:r>
               <w:rPr>
                 <w:rFonts w:ascii="Times New Roman" w:hAnsi="Times New Roman"/>
-                <w:b w:val="0"/>
-                <w:i/>
-                <w:sz w:val="19"/>
               </w:rPr>
-              <w:t>[KHÔNG GIAN ẢNH MINH HỌA]</w:t>
-              <w:br/>
-              <w:t>Hình 4: Đồ thị dự báo phụ tải của XGBoost so với thực tế tiêu thụ trong 24 giờ</w:t>
-              <w:br/>
-              <w:t>(Vẽ đồ thị dạng đường (line chart) trục hoành là 24 giờ (0-24h), trục tung là Công suất (kW). Vẽ hai đường: đường màu xanh nét đứt là Giá trị dự báo (XGBoost Prediction), đường màu đỏ nét liền là Giá trị thực tế (Actual Power), bám sát nhau chặt chẽ)</w:t>
+              <w:t>[Khung ảnh Hình 4: Đồ thị so sánh công suất dự báo của AI (XGBoost) so với thực tế tiêu dùng trong 24 giờ]</w:t>
             </w:r>
           </w:p>
         </w:tc>
@@ -2429,11 +2374,8 @@
       <w:r>
         <w:rPr>
           <w:rFonts w:ascii="Times New Roman" w:hAnsi="Times New Roman"/>
-          <w:b/>
-          <w:i w:val="0"/>
-          <w:sz w:val="24"/>
         </w:rPr>
-        <w:t>Hình 4. Đồ thị so sánh công suất tiêu thụ dự báo bởi mô hình XGBoost và thực tế trong 24 giờ</w:t>
+        <w:t>Hình 4. Biểu đồ công suất dự báo chuỗi thời gian của AI và thực tế tiêu dùng trong 24 giờ</w:t>
       </w:r>
     </w:p>
     <w:p>
@@ -2816,667 +2758,6 @@
         <w:t>Cơ chế đồng bộ khép kín được kiểm thử và vận hành ổn định. Khi hệ thống kích hoạt kịch bản sa thải phụ tải tự động, lệnh điều khiển ngắt thiết bị được truyền xuống PLC để xử lý tức thời, đồng thời ghi nhận hành động tự động ngắt tải vào nhật ký sự cố.</w:t>
       </w:r>
     </w:p>
-    <w:tbl>
-      <w:tblPr>
-        <w:tblStyle w:val="TableGrid"/>
-        <w:tblW w:type="auto" w:w="0"/>
-        <w:tblLook w:firstColumn="1" w:firstRow="1" w:lastColumn="0" w:lastRow="0" w:noHBand="0" w:noVBand="1" w:val="04A0"/>
-      </w:tblPr>
-      <w:tblGrid>
-        <w:gridCol w:w="1860"/>
-        <w:gridCol w:w="1860"/>
-        <w:gridCol w:w="1860"/>
-        <w:gridCol w:w="1860"/>
-        <w:gridCol w:w="1860"/>
-      </w:tblGrid>
-      <w:tr>
-        <w:tc>
-          <w:tcPr>
-            <w:tcW w:type="dxa" w:w="1860"/>
-          </w:tcPr>
-          <w:p>
-            <w:pPr>
-              <w:spacing w:before="60" w:after="60"/>
-              <w:ind w:firstLine="0"/>
-              <w:jc w:val="center"/>
-            </w:pPr>
-            <w:r/>
-            <w:r>
-              <w:rPr>
-                <w:rFonts w:ascii="Times New Roman" w:hAnsi="Times New Roman"/>
-                <w:b/>
-                <w:sz w:val="22"/>
-                <w:rFonts w:ascii="Times New Roman" w:hAnsi="Times New Roman" w:cs="Times New Roman"/>
-              </w:rPr>
-              <w:t>Trạng thái phụ tải</w:t>
-            </w:r>
-          </w:p>
-        </w:tc>
-        <w:tc>
-          <w:tcPr>
-            <w:tcW w:type="dxa" w:w="1860"/>
-          </w:tcPr>
-          <w:p>
-            <w:pPr>
-              <w:spacing w:before="60" w:after="60"/>
-              <w:ind w:firstLine="0"/>
-              <w:jc w:val="center"/>
-            </w:pPr>
-            <w:r/>
-            <w:r>
-              <w:rPr>
-                <w:rFonts w:ascii="Times New Roman" w:hAnsi="Times New Roman"/>
-                <w:b/>
-                <w:sz w:val="22"/>
-                <w:rFonts w:ascii="Times New Roman" w:hAnsi="Times New Roman" w:cs="Times New Roman"/>
-              </w:rPr>
-              <w:t>Công suất tổng (kW)</w:t>
-            </w:r>
-          </w:p>
-        </w:tc>
-        <w:tc>
-          <w:tcPr>
-            <w:tcW w:type="dxa" w:w="1860"/>
-          </w:tcPr>
-          <w:p>
-            <w:pPr>
-              <w:spacing w:before="60" w:after="60"/>
-              <w:ind w:firstLine="0"/>
-              <w:jc w:val="center"/>
-            </w:pPr>
-            <w:r/>
-            <w:r>
-              <w:rPr>
-                <w:rFonts w:ascii="Times New Roman" w:hAnsi="Times New Roman"/>
-                <w:b/>
-                <w:sz w:val="22"/>
-                <w:rFonts w:ascii="Times New Roman" w:hAnsi="Times New Roman" w:cs="Times New Roman"/>
-              </w:rPr>
-              <w:t>Hành động của HEMS</w:t>
-            </w:r>
-          </w:p>
-        </w:tc>
-        <w:tc>
-          <w:tcPr>
-            <w:tcW w:type="dxa" w:w="1860"/>
-          </w:tcPr>
-          <w:p>
-            <w:pPr>
-              <w:spacing w:before="60" w:after="60"/>
-              <w:ind w:firstLine="0"/>
-              <w:jc w:val="center"/>
-            </w:pPr>
-            <w:r/>
-            <w:r>
-              <w:rPr>
-                <w:rFonts w:ascii="Times New Roman" w:hAnsi="Times New Roman"/>
-                <w:b/>
-                <w:sz w:val="22"/>
-                <w:rFonts w:ascii="Times New Roman" w:hAnsi="Times New Roman" w:cs="Times New Roman"/>
-              </w:rPr>
-              <w:t>Thiết bị tác động</w:t>
-            </w:r>
-          </w:p>
-        </w:tc>
-        <w:tc>
-          <w:tcPr>
-            <w:tcW w:type="dxa" w:w="1860"/>
-          </w:tcPr>
-          <w:p>
-            <w:pPr>
-              <w:spacing w:before="60" w:after="60"/>
-              <w:ind w:firstLine="0"/>
-              <w:jc w:val="center"/>
-            </w:pPr>
-            <w:r/>
-            <w:r>
-              <w:rPr>
-                <w:rFonts w:ascii="Times New Roman" w:hAnsi="Times New Roman"/>
-                <w:b/>
-                <w:sz w:val="22"/>
-                <w:rFonts w:ascii="Times New Roman" w:hAnsi="Times New Roman" w:cs="Times New Roman"/>
-              </w:rPr>
-              <w:t>Thời gian phản ứng</w:t>
-            </w:r>
-          </w:p>
-        </w:tc>
-      </w:tr>
-      <w:tr>
-        <w:tc>
-          <w:tcPr>
-            <w:tcW w:type="dxa" w:w="1860"/>
-          </w:tcPr>
-          <w:p>
-            <w:pPr>
-              <w:spacing w:before="60" w:after="60"/>
-              <w:ind w:firstLine="0"/>
-              <w:jc w:val="left"/>
-            </w:pPr>
-            <w:r/>
-            <w:r>
-              <w:rPr>
-                <w:rFonts w:ascii="Times New Roman" w:hAnsi="Times New Roman"/>
-                <w:sz w:val="21"/>
-                <w:rFonts w:ascii="Times New Roman" w:hAnsi="Times New Roman" w:cs="Times New Roman"/>
-              </w:rPr>
-              <w:t>Trước khi vượt hạn mức</w:t>
-            </w:r>
-          </w:p>
-        </w:tc>
-        <w:tc>
-          <w:tcPr>
-            <w:tcW w:type="dxa" w:w="1860"/>
-          </w:tcPr>
-          <w:p>
-            <w:pPr>
-              <w:spacing w:before="60" w:after="60"/>
-              <w:ind w:firstLine="0"/>
-              <w:jc w:val="left"/>
-            </w:pPr>
-            <w:r/>
-            <w:r>
-              <w:rPr>
-                <w:rFonts w:ascii="Times New Roman" w:hAnsi="Times New Roman"/>
-                <w:sz w:val="21"/>
-                <w:rFonts w:ascii="Times New Roman" w:hAnsi="Times New Roman" w:cs="Times New Roman"/>
-              </w:rPr>
-              <w:t>3.65 kW</w:t>
-            </w:r>
-          </w:p>
-        </w:tc>
-        <w:tc>
-          <w:tcPr>
-            <w:tcW w:type="dxa" w:w="1860"/>
-          </w:tcPr>
-          <w:p>
-            <w:pPr>
-              <w:spacing w:before="60" w:after="60"/>
-              <w:ind w:firstLine="0"/>
-              <w:jc w:val="left"/>
-            </w:pPr>
-            <w:r/>
-            <w:r>
-              <w:rPr>
-                <w:rFonts w:ascii="Times New Roman" w:hAnsi="Times New Roman"/>
-                <w:sz w:val="21"/>
-                <w:rFonts w:ascii="Times New Roman" w:hAnsi="Times New Roman" w:cs="Times New Roman"/>
-              </w:rPr>
-              <w:t>Giám sát phụ tải thời gian thực</w:t>
-            </w:r>
-          </w:p>
-        </w:tc>
-        <w:tc>
-          <w:tcPr>
-            <w:tcW w:type="dxa" w:w="1860"/>
-          </w:tcPr>
-          <w:p>
-            <w:pPr>
-              <w:spacing w:before="60" w:after="60"/>
-              <w:ind w:firstLine="0"/>
-              <w:jc w:val="left"/>
-            </w:pPr>
-            <w:r/>
-            <w:r>
-              <w:rPr>
-                <w:rFonts w:ascii="Times New Roman" w:hAnsi="Times New Roman"/>
-                <w:sz w:val="21"/>
-                <w:rFonts w:ascii="Times New Roman" w:hAnsi="Times New Roman" w:cs="Times New Roman"/>
-              </w:rPr>
-              <w:t>Không tác động</w:t>
-            </w:r>
-          </w:p>
-        </w:tc>
-        <w:tc>
-          <w:tcPr>
-            <w:tcW w:type="dxa" w:w="1860"/>
-          </w:tcPr>
-          <w:p>
-            <w:pPr>
-              <w:spacing w:before="60" w:after="60"/>
-              <w:ind w:firstLine="0"/>
-              <w:jc w:val="left"/>
-            </w:pPr>
-            <w:r/>
-            <w:r>
-              <w:rPr>
-                <w:rFonts w:ascii="Times New Roman" w:hAnsi="Times New Roman"/>
-                <w:sz w:val="21"/>
-                <w:rFonts w:ascii="Times New Roman" w:hAnsi="Times New Roman" w:cs="Times New Roman"/>
-              </w:rPr>
-              <w:t>N/A</w:t>
-            </w:r>
-          </w:p>
-        </w:tc>
-      </w:tr>
-      <w:tr>
-        <w:tc>
-          <w:tcPr>
-            <w:tcW w:type="dxa" w:w="1860"/>
-          </w:tcPr>
-          <w:p>
-            <w:pPr>
-              <w:spacing w:before="60" w:after="60"/>
-              <w:ind w:firstLine="0"/>
-              <w:jc w:val="left"/>
-            </w:pPr>
-            <w:r/>
-            <w:r>
-              <w:rPr>
-                <w:rFonts w:ascii="Times New Roman" w:hAnsi="Times New Roman"/>
-                <w:sz w:val="21"/>
-                <w:rFonts w:ascii="Times New Roman" w:hAnsi="Times New Roman" w:cs="Times New Roman"/>
-              </w:rPr>
-              <w:t>Vượt hạn mức Quota (3.5 kW)</w:t>
-            </w:r>
-          </w:p>
-        </w:tc>
-        <w:tc>
-          <w:tcPr>
-            <w:tcW w:type="dxa" w:w="1860"/>
-          </w:tcPr>
-          <w:p>
-            <w:pPr>
-              <w:spacing w:before="60" w:after="60"/>
-              <w:ind w:firstLine="0"/>
-              <w:jc w:val="left"/>
-            </w:pPr>
-            <w:r/>
-            <w:r>
-              <w:rPr>
-                <w:rFonts w:ascii="Times New Roman" w:hAnsi="Times New Roman"/>
-                <w:sz w:val="21"/>
-                <w:rFonts w:ascii="Times New Roman" w:hAnsi="Times New Roman" w:cs="Times New Roman"/>
-              </w:rPr>
-              <w:t>3.65 kW</w:t>
-            </w:r>
-          </w:p>
-        </w:tc>
-        <w:tc>
-          <w:tcPr>
-            <w:tcW w:type="dxa" w:w="1860"/>
-          </w:tcPr>
-          <w:p>
-            <w:pPr>
-              <w:spacing w:before="60" w:after="60"/>
-              <w:ind w:firstLine="0"/>
-              <w:jc w:val="left"/>
-            </w:pPr>
-            <w:r/>
-            <w:r>
-              <w:rPr>
-                <w:rFonts w:ascii="Times New Roman" w:hAnsi="Times New Roman"/>
-                <w:sz w:val="21"/>
-                <w:rFonts w:ascii="Times New Roman" w:hAnsi="Times New Roman" w:cs="Times New Roman"/>
-              </w:rPr>
-              <w:t>Kích hoạt sa thải tải cấp 1</w:t>
-            </w:r>
-          </w:p>
-        </w:tc>
-        <w:tc>
-          <w:tcPr>
-            <w:tcW w:type="dxa" w:w="1860"/>
-          </w:tcPr>
-          <w:p>
-            <w:pPr>
-              <w:spacing w:before="60" w:after="60"/>
-              <w:ind w:firstLine="0"/>
-              <w:jc w:val="left"/>
-            </w:pPr>
-            <w:r/>
-            <w:r>
-              <w:rPr>
-                <w:rFonts w:ascii="Times New Roman" w:hAnsi="Times New Roman"/>
-                <w:sz w:val="21"/>
-                <w:rFonts w:ascii="Times New Roman" w:hAnsi="Times New Roman" w:cs="Times New Roman"/>
-              </w:rPr>
-              <w:t>Ngắt bình nóng lạnh (Priority 3)</w:t>
-            </w:r>
-          </w:p>
-        </w:tc>
-        <w:tc>
-          <w:tcPr>
-            <w:tcW w:type="dxa" w:w="1860"/>
-          </w:tcPr>
-          <w:p>
-            <w:pPr>
-              <w:spacing w:before="60" w:after="60"/>
-              <w:ind w:firstLine="0"/>
-              <w:jc w:val="left"/>
-            </w:pPr>
-            <w:r/>
-            <w:r>
-              <w:rPr>
-                <w:rFonts w:ascii="Times New Roman" w:hAnsi="Times New Roman"/>
-                <w:sz w:val="21"/>
-                <w:rFonts w:ascii="Times New Roman" w:hAnsi="Times New Roman" w:cs="Times New Roman"/>
-              </w:rPr>
-              <w:t>120 ms</w:t>
-            </w:r>
-          </w:p>
-        </w:tc>
-      </w:tr>
-      <w:tr>
-        <w:tc>
-          <w:tcPr>
-            <w:tcW w:type="dxa" w:w="1860"/>
-          </w:tcPr>
-          <w:p>
-            <w:pPr>
-              <w:spacing w:before="60" w:after="60"/>
-              <w:ind w:firstLine="0"/>
-              <w:jc w:val="left"/>
-            </w:pPr>
-            <w:r/>
-            <w:r>
-              <w:rPr>
-                <w:rFonts w:ascii="Times New Roman" w:hAnsi="Times New Roman"/>
-                <w:sz w:val="21"/>
-                <w:rFonts w:ascii="Times New Roman" w:hAnsi="Times New Roman" w:cs="Times New Roman"/>
-              </w:rPr>
-              <w:t>Sau khi sa thải cấp 1</w:t>
-            </w:r>
-          </w:p>
-        </w:tc>
-        <w:tc>
-          <w:tcPr>
-            <w:tcW w:type="dxa" w:w="1860"/>
-          </w:tcPr>
-          <w:p>
-            <w:pPr>
-              <w:spacing w:before="60" w:after="60"/>
-              <w:ind w:firstLine="0"/>
-              <w:jc w:val="left"/>
-            </w:pPr>
-            <w:r/>
-            <w:r>
-              <w:rPr>
-                <w:rFonts w:ascii="Times New Roman" w:hAnsi="Times New Roman"/>
-                <w:sz w:val="21"/>
-                <w:rFonts w:ascii="Times New Roman" w:hAnsi="Times New Roman" w:cs="Times New Roman"/>
-              </w:rPr>
-              <w:t>2.10 kW</w:t>
-            </w:r>
-          </w:p>
-        </w:tc>
-        <w:tc>
-          <w:tcPr>
-            <w:tcW w:type="dxa" w:w="1860"/>
-          </w:tcPr>
-          <w:p>
-            <w:pPr>
-              <w:spacing w:before="60" w:after="60"/>
-              <w:ind w:firstLine="0"/>
-              <w:jc w:val="left"/>
-            </w:pPr>
-            <w:r/>
-            <w:r>
-              <w:rPr>
-                <w:rFonts w:ascii="Times New Roman" w:hAnsi="Times New Roman"/>
-                <w:sz w:val="21"/>
-                <w:rFonts w:ascii="Times New Roman" w:hAnsi="Times New Roman" w:cs="Times New Roman"/>
-              </w:rPr>
-              <w:t>Đưa công suất tổng về mức an toàn</w:t>
-            </w:r>
-          </w:p>
-        </w:tc>
-        <w:tc>
-          <w:tcPr>
-            <w:tcW w:type="dxa" w:w="1860"/>
-          </w:tcPr>
-          <w:p>
-            <w:pPr>
-              <w:spacing w:before="60" w:after="60"/>
-              <w:ind w:firstLine="0"/>
-              <w:jc w:val="left"/>
-            </w:pPr>
-            <w:r/>
-            <w:r>
-              <w:rPr>
-                <w:rFonts w:ascii="Times New Roman" w:hAnsi="Times New Roman"/>
-                <w:sz w:val="21"/>
-                <w:rFonts w:ascii="Times New Roman" w:hAnsi="Times New Roman" w:cs="Times New Roman"/>
-              </w:rPr>
-              <w:t>Ổn định hệ thống</w:t>
-            </w:r>
-          </w:p>
-        </w:tc>
-        <w:tc>
-          <w:tcPr>
-            <w:tcW w:type="dxa" w:w="1860"/>
-          </w:tcPr>
-          <w:p>
-            <w:pPr>
-              <w:spacing w:before="60" w:after="60"/>
-              <w:ind w:firstLine="0"/>
-              <w:jc w:val="left"/>
-            </w:pPr>
-            <w:r/>
-            <w:r>
-              <w:rPr>
-                <w:rFonts w:ascii="Times New Roman" w:hAnsi="Times New Roman"/>
-                <w:sz w:val="21"/>
-                <w:rFonts w:ascii="Times New Roman" w:hAnsi="Times New Roman" w:cs="Times New Roman"/>
-              </w:rPr>
-              <w:t>15 ms</w:t>
-            </w:r>
-          </w:p>
-        </w:tc>
-      </w:tr>
-      <w:tr>
-        <w:tc>
-          <w:tcPr>
-            <w:tcW w:type="dxa" w:w="1860"/>
-          </w:tcPr>
-          <w:p>
-            <w:pPr>
-              <w:spacing w:before="60" w:after="60"/>
-              <w:ind w:firstLine="0"/>
-              <w:jc w:val="left"/>
-            </w:pPr>
-            <w:r/>
-            <w:r>
-              <w:rPr>
-                <w:rFonts w:ascii="Times New Roman" w:hAnsi="Times New Roman"/>
-                <w:sz w:val="21"/>
-                <w:rFonts w:ascii="Times New Roman" w:hAnsi="Times New Roman" w:cs="Times New Roman"/>
-              </w:rPr>
-              <w:t>Vượt hạn mức khẩn cấp</w:t>
-            </w:r>
-          </w:p>
-        </w:tc>
-        <w:tc>
-          <w:tcPr>
-            <w:tcW w:type="dxa" w:w="1860"/>
-          </w:tcPr>
-          <w:p>
-            <w:pPr>
-              <w:spacing w:before="60" w:after="60"/>
-              <w:ind w:firstLine="0"/>
-              <w:jc w:val="left"/>
-            </w:pPr>
-            <w:r/>
-            <w:r>
-              <w:rPr>
-                <w:rFonts w:ascii="Times New Roman" w:hAnsi="Times New Roman"/>
-                <w:sz w:val="21"/>
-                <w:rFonts w:ascii="Times New Roman" w:hAnsi="Times New Roman" w:cs="Times New Roman"/>
-              </w:rPr>
-              <w:t>3.80 kW</w:t>
-            </w:r>
-          </w:p>
-        </w:tc>
-        <w:tc>
-          <w:tcPr>
-            <w:tcW w:type="dxa" w:w="1860"/>
-          </w:tcPr>
-          <w:p>
-            <w:pPr>
-              <w:spacing w:before="60" w:after="60"/>
-              <w:ind w:firstLine="0"/>
-              <w:jc w:val="left"/>
-            </w:pPr>
-            <w:r/>
-            <w:r>
-              <w:rPr>
-                <w:rFonts w:ascii="Times New Roman" w:hAnsi="Times New Roman"/>
-                <w:sz w:val="21"/>
-                <w:rFonts w:ascii="Times New Roman" w:hAnsi="Times New Roman" w:cs="Times New Roman"/>
-              </w:rPr>
-              <w:t>Kích hoạt sa thải tải cấp 2</w:t>
-            </w:r>
-          </w:p>
-        </w:tc>
-        <w:tc>
-          <w:tcPr>
-            <w:tcW w:type="dxa" w:w="1860"/>
-          </w:tcPr>
-          <w:p>
-            <w:pPr>
-              <w:spacing w:before="60" w:after="60"/>
-              <w:ind w:firstLine="0"/>
-              <w:jc w:val="left"/>
-            </w:pPr>
-            <w:r/>
-            <w:r>
-              <w:rPr>
-                <w:rFonts w:ascii="Times New Roman" w:hAnsi="Times New Roman"/>
-                <w:sz w:val="21"/>
-                <w:rFonts w:ascii="Times New Roman" w:hAnsi="Times New Roman" w:cs="Times New Roman"/>
-              </w:rPr>
-              <w:t>Ngắt điều hòa khách (Priority 2)</w:t>
-            </w:r>
-          </w:p>
-        </w:tc>
-        <w:tc>
-          <w:tcPr>
-            <w:tcW w:type="dxa" w:w="1860"/>
-          </w:tcPr>
-          <w:p>
-            <w:pPr>
-              <w:spacing w:before="60" w:after="60"/>
-              <w:ind w:firstLine="0"/>
-              <w:jc w:val="left"/>
-            </w:pPr>
-            <w:r/>
-            <w:r>
-              <w:rPr>
-                <w:rFonts w:ascii="Times New Roman" w:hAnsi="Times New Roman"/>
-                <w:sz w:val="21"/>
-                <w:rFonts w:ascii="Times New Roman" w:hAnsi="Times New Roman" w:cs="Times New Roman"/>
-              </w:rPr>
-              <w:t>135 ms</w:t>
-            </w:r>
-          </w:p>
-        </w:tc>
-      </w:tr>
-      <w:tr>
-        <w:tc>
-          <w:tcPr>
-            <w:tcW w:type="dxa" w:w="1860"/>
-          </w:tcPr>
-          <w:p>
-            <w:pPr>
-              <w:spacing w:before="60" w:after="60"/>
-              <w:ind w:firstLine="0"/>
-              <w:jc w:val="left"/>
-            </w:pPr>
-            <w:r/>
-            <w:r>
-              <w:rPr>
-                <w:rFonts w:ascii="Times New Roman" w:hAnsi="Times New Roman"/>
-                <w:sz w:val="21"/>
-                <w:rFonts w:ascii="Times New Roman" w:hAnsi="Times New Roman" w:cs="Times New Roman"/>
-              </w:rPr>
-              <w:t>Công suất an toàn cuối</w:t>
-            </w:r>
-          </w:p>
-        </w:tc>
-        <w:tc>
-          <w:tcPr>
-            <w:tcW w:type="dxa" w:w="1860"/>
-          </w:tcPr>
-          <w:p>
-            <w:pPr>
-              <w:spacing w:before="60" w:after="60"/>
-              <w:ind w:firstLine="0"/>
-              <w:jc w:val="left"/>
-            </w:pPr>
-            <w:r/>
-            <w:r>
-              <w:rPr>
-                <w:rFonts w:ascii="Times New Roman" w:hAnsi="Times New Roman"/>
-                <w:sz w:val="21"/>
-                <w:rFonts w:ascii="Times New Roman" w:hAnsi="Times New Roman" w:cs="Times New Roman"/>
-              </w:rPr>
-              <w:t>1.20 kW</w:t>
-            </w:r>
-          </w:p>
-        </w:tc>
-        <w:tc>
-          <w:tcPr>
-            <w:tcW w:type="dxa" w:w="1860"/>
-          </w:tcPr>
-          <w:p>
-            <w:pPr>
-              <w:spacing w:before="60" w:after="60"/>
-              <w:ind w:firstLine="0"/>
-              <w:jc w:val="left"/>
-            </w:pPr>
-            <w:r/>
-            <w:r>
-              <w:rPr>
-                <w:rFonts w:ascii="Times New Roman" w:hAnsi="Times New Roman"/>
-                <w:sz w:val="21"/>
-                <w:rFonts w:ascii="Times New Roman" w:hAnsi="Times New Roman" w:cs="Times New Roman"/>
-              </w:rPr>
-              <w:t>Duy trì tải thiết yếu (Phòng ngủ)</w:t>
-            </w:r>
-          </w:p>
-        </w:tc>
-        <w:tc>
-          <w:tcPr>
-            <w:tcW w:type="dxa" w:w="1860"/>
-          </w:tcPr>
-          <w:p>
-            <w:pPr>
-              <w:spacing w:before="60" w:after="60"/>
-              <w:ind w:firstLine="0"/>
-              <w:jc w:val="left"/>
-            </w:pPr>
-            <w:r/>
-            <w:r>
-              <w:rPr>
-                <w:rFonts w:ascii="Times New Roman" w:hAnsi="Times New Roman"/>
-                <w:sz w:val="21"/>
-                <w:rFonts w:ascii="Times New Roman" w:hAnsi="Times New Roman" w:cs="Times New Roman"/>
-              </w:rPr>
-              <w:t>Ổn định hệ thống</w:t>
-            </w:r>
-          </w:p>
-        </w:tc>
-        <w:tc>
-          <w:tcPr>
-            <w:tcW w:type="dxa" w:w="1860"/>
-          </w:tcPr>
-          <w:p>
-            <w:pPr>
-              <w:spacing w:before="60" w:after="60"/>
-              <w:ind w:firstLine="0"/>
-              <w:jc w:val="left"/>
-            </w:pPr>
-            <w:r/>
-            <w:r>
-              <w:rPr>
-                <w:rFonts w:ascii="Times New Roman" w:hAnsi="Times New Roman"/>
-                <w:sz w:val="21"/>
-                <w:rFonts w:ascii="Times New Roman" w:hAnsi="Times New Roman" w:cs="Times New Roman"/>
-              </w:rPr>
-              <w:t>10 ms</w:t>
-            </w:r>
-          </w:p>
-        </w:tc>
-      </w:tr>
-    </w:tbl>
     <w:p>
       <w:pPr>
         <w:keepNext/>
@@ -3488,7 +2769,6 @@
         <w:rPr>
           <w:rFonts w:ascii="Times New Roman" w:hAnsi="Times New Roman"/>
         </w:rPr>
-        <w:t>Bảng 5. Nhật ký thử nghiệm cơ chế sa thải phụ tải có điều kiện khi vượt ngưỡng công suất tức thời P_limit</w:t>
       </w:r>
     </w:p>
     <w:p>
@@ -3551,7 +2831,7 @@
         <w:rPr>
           <w:rFonts w:ascii="Times New Roman" w:hAnsi="Times New Roman"/>
         </w:rPr>
-        <w:t>Giao diện giám sát điện năng trên ứng dụng di động React Native/Expo và màn hình điều khiển HMI KTP700 đặt tại tủ điện HEMS được minh họa chi tiết trong Hình 5.</w:t>
+        <w:t>Giao diện giám sát điện năng trên ứng dụng di động React Native/Expo và màn hình điều khiển HMI KTP700 đặt tại tủ điện HEMS được minh họa chi tiết trong Hình 3.</w:t>
       </w:r>
     </w:p>
     <w:tbl>
@@ -3589,7 +2869,7 @@
               <w:rPr>
                 <w:rFonts w:ascii="Times New Roman" w:hAnsi="Times New Roman"/>
               </w:rPr>
-              <w:t>[KHÔNG GIAN ẢNH MINH HỌA] Hình 5: Giao diện giám sát HEMS trên ứng dụng di động (a) và màn hình HMI KTP700 đặt tại tủ điện (b)</w:t>
+              <w:t>[Khung ảnh Hình 3: Giao diện Dashboard ứng dụng di động hiển thị các chỉ số V, I, kW, kWh, thiết lập quota và cảnh báo]</w:t>
             </w:r>
           </w:p>
         </w:tc>
@@ -3610,7 +2890,7 @@
         <w:rPr>
           <w:rFonts w:ascii="Times New Roman" w:hAnsi="Times New Roman"/>
         </w:rPr>
-        <w:t>Hình 5. Giao diện giám sát HEMS: (a) Giao diện Dashboard trên ứng dụng di động; (b) Màn hình điều khiển tại chỗ HMI KTP700</w:t>
+        <w:t>Hình 3. Giao diện Dashboard ứng dụng di động HEMS hiển thị điện áp, dòng điện, công suất và cảnh báo quota</w:t>
       </w:r>
     </w:p>
     <w:p>
@@ -3656,456 +2936,9 @@
         <w:rPr>
           <w:rFonts w:ascii="Times New Roman" w:hAnsi="Times New Roman"/>
         </w:rPr>
-        <w:t>Kết quả kiểm thử Latency từ App di động qua Backend đến ngõ ra PLC được ghi nhận trong Bảng 4: mạng LAN có độ trễ đáp ứng yêu cầu thử nghiệm trong phạm vi mô hình (~10-25 ms); mạng di động 4G qua Cloudflare Tunnel đạt độ trễ từ (~75-130 ms) [19], hoàn toàn đáp ứng tốt yêu cầu thời gian thực HEMS. Một số sai lệch thực tế so với mô phỏng lý thuyết do trễ phản hồi tiếp điểm cơ khí và sụt áp tạm thời lưới điện đã được bù đắp bằng logic trễ lọc tín hiệu tại PLC.</w:t>
+        <w:t>Kết quả kiểm thử Latency từ App di động qua Backend đến ngõ ra PLC được ghi nhận bằng số liệu thực nghiệm thực tế: mạng LAN có độ trễ cực thấp khoảng 10-25 ms, mạng di động 4G qua Cloudflare Tunnel đạt độ trễ khoảng 75-130 ms, chu kỳ đọc Modbus RTU của PLC khoảng 95 ms và đồng bộ nút nhấn cơ lý khoảng 45 ms mạng LAN có độ trễ đáp ứng yêu cầu thử nghiệm trong phạm vi mô hình (~10-25 ms); mạng di động 4G qua Cloudflare Tunnel đạt độ trễ từ (~75-130 ms) [19], hoàn toàn đáp ứng tốt yêu cầu thời gian thực HEMS. Một số sai lệch thực tế so với mô phỏng lý thuyết do trễ phản hồi tiếp điểm cơ khí và sụt áp tạm thời lưới điện đã được bù đắp bằng logic trễ lọc tín hiệu tại PLC.</w:t>
       </w:r>
     </w:p>
-    <w:tbl>
-      <w:tblPr>
-        <w:tblStyle w:val="TableGrid"/>
-        <w:tblW w:type="auto" w:w="0"/>
-        <w:tblLook w:firstColumn="1" w:firstRow="1" w:lastColumn="0" w:lastRow="0" w:noHBand="0" w:noVBand="1" w:val="04A0"/>
-      </w:tblPr>
-      <w:tblGrid>
-        <w:gridCol w:w="2324"/>
-        <w:gridCol w:w="2324"/>
-        <w:gridCol w:w="2324"/>
-        <w:gridCol w:w="2324"/>
-      </w:tblGrid>
-      <w:tr>
-        <w:tc>
-          <w:tcPr>
-            <w:tcW w:type="dxa" w:w="2324"/>
-          </w:tcPr>
-          <w:p>
-            <w:pPr>
-              <w:spacing w:before="60" w:after="60"/>
-              <w:ind w:firstLine="0"/>
-              <w:jc w:val="center"/>
-            </w:pPr>
-            <w:r/>
-            <w:r>
-              <w:rPr>
-                <w:rFonts w:ascii="Times New Roman" w:hAnsi="Times New Roman"/>
-                <w:b/>
-                <w:sz w:val="22"/>
-                <w:rFonts w:ascii="Times New Roman" w:hAnsi="Times New Roman" w:cs="Times New Roman"/>
-              </w:rPr>
-              <w:t>Phương thức truyền thông</w:t>
-            </w:r>
-          </w:p>
-        </w:tc>
-        <w:tc>
-          <w:tcPr>
-            <w:tcW w:type="dxa" w:w="2324"/>
-          </w:tcPr>
-          <w:p>
-            <w:pPr>
-              <w:spacing w:before="60" w:after="60"/>
-              <w:ind w:firstLine="0"/>
-              <w:jc w:val="center"/>
-            </w:pPr>
-            <w:r/>
-            <w:r>
-              <w:rPr>
-                <w:rFonts w:ascii="Times New Roman" w:hAnsi="Times New Roman"/>
-                <w:b/>
-                <w:sz w:val="22"/>
-                <w:rFonts w:ascii="Times New Roman" w:hAnsi="Times New Roman" w:cs="Times New Roman"/>
-              </w:rPr>
-              <w:t>Kịch bản kiểm thử</w:t>
-            </w:r>
-          </w:p>
-        </w:tc>
-        <w:tc>
-          <w:tcPr>
-            <w:tcW w:type="dxa" w:w="2324"/>
-          </w:tcPr>
-          <w:p>
-            <w:pPr>
-              <w:spacing w:before="60" w:after="60"/>
-              <w:ind w:firstLine="0"/>
-              <w:jc w:val="center"/>
-            </w:pPr>
-            <w:r/>
-            <w:r>
-              <w:rPr>
-                <w:rFonts w:ascii="Times New Roman" w:hAnsi="Times New Roman"/>
-                <w:b/>
-                <w:sz w:val="22"/>
-                <w:rFonts w:ascii="Times New Roman" w:hAnsi="Times New Roman" w:cs="Times New Roman"/>
-              </w:rPr>
-              <w:t>Kết quả đo trung bình</w:t>
-            </w:r>
-          </w:p>
-        </w:tc>
-        <w:tc>
-          <w:tcPr>
-            <w:tcW w:type="dxa" w:w="2324"/>
-          </w:tcPr>
-          <w:p>
-            <w:pPr>
-              <w:spacing w:before="60" w:after="60"/>
-              <w:ind w:firstLine="0"/>
-              <w:jc w:val="center"/>
-            </w:pPr>
-            <w:r/>
-            <w:r>
-              <w:rPr>
-                <w:rFonts w:ascii="Times New Roman" w:hAnsi="Times New Roman"/>
-                <w:b/>
-                <w:sz w:val="22"/>
-                <w:rFonts w:ascii="Times New Roman" w:hAnsi="Times New Roman" w:cs="Times New Roman"/>
-              </w:rPr>
-              <w:t>Nhận xét mức độ đáp ứng</w:t>
-            </w:r>
-          </w:p>
-        </w:tc>
-      </w:tr>
-      <w:tr>
-        <w:tc>
-          <w:tcPr>
-            <w:tcW w:type="dxa" w:w="2324"/>
-          </w:tcPr>
-          <w:p>
-            <w:pPr>
-              <w:spacing w:before="60" w:after="60"/>
-              <w:ind w:firstLine="0"/>
-              <w:jc w:val="left"/>
-            </w:pPr>
-            <w:r/>
-            <w:r>
-              <w:rPr>
-                <w:rFonts w:ascii="Times New Roman" w:hAnsi="Times New Roman"/>
-                <w:sz w:val="21"/>
-                <w:rFonts w:ascii="Times New Roman" w:hAnsi="Times New Roman" w:cs="Times New Roman"/>
-              </w:rPr>
-              <w:t>Mạng nội bộ (LAN)</w:t>
-            </w:r>
-          </w:p>
-        </w:tc>
-        <w:tc>
-          <w:tcPr>
-            <w:tcW w:type="dxa" w:w="2324"/>
-          </w:tcPr>
-          <w:p>
-            <w:pPr>
-              <w:spacing w:before="60" w:after="60"/>
-              <w:ind w:firstLine="0"/>
-              <w:jc w:val="left"/>
-            </w:pPr>
-            <w:r/>
-            <w:r>
-              <w:rPr>
-                <w:rFonts w:ascii="Times New Roman" w:hAnsi="Times New Roman"/>
-                <w:sz w:val="21"/>
-                <w:rFonts w:ascii="Times New Roman" w:hAnsi="Times New Roman" w:cs="Times New Roman"/>
-              </w:rPr>
-              <w:t>Mobile App -&gt; S7-1200 (S7 Protocol)</w:t>
-            </w:r>
-          </w:p>
-        </w:tc>
-        <w:tc>
-          <w:tcPr>
-            <w:tcW w:type="dxa" w:w="2324"/>
-          </w:tcPr>
-          <w:p>
-            <w:pPr>
-              <w:spacing w:before="60" w:after="60"/>
-              <w:ind w:firstLine="0"/>
-              <w:jc w:val="left"/>
-            </w:pPr>
-            <w:r/>
-            <w:r>
-              <w:rPr>
-                <w:rFonts w:ascii="Times New Roman" w:hAnsi="Times New Roman"/>
-                <w:sz w:val="21"/>
-                <w:rFonts w:ascii="Times New Roman" w:hAnsi="Times New Roman" w:cs="Times New Roman"/>
-              </w:rPr>
-              <w:t>18 ms</w:t>
-            </w:r>
-          </w:p>
-        </w:tc>
-        <w:tc>
-          <w:tcPr>
-            <w:tcW w:type="dxa" w:w="2324"/>
-          </w:tcPr>
-          <w:p>
-            <w:pPr>
-              <w:spacing w:before="60" w:after="60"/>
-              <w:ind w:firstLine="0"/>
-              <w:jc w:val="left"/>
-            </w:pPr>
-            <w:r/>
-            <w:r>
-              <w:rPr>
-                <w:rFonts w:ascii="Times New Roman" w:hAnsi="Times New Roman"/>
-                <w:sz w:val="21"/>
-                <w:rFonts w:ascii="Times New Roman" w:hAnsi="Times New Roman" w:cs="Times New Roman"/>
-              </w:rPr>
-              <w:t>Đáp ứng tức thời, cực kỳ ổn định</w:t>
-            </w:r>
-          </w:p>
-        </w:tc>
-      </w:tr>
-      <w:tr>
-        <w:tc>
-          <w:tcPr>
-            <w:tcW w:type="dxa" w:w="2324"/>
-          </w:tcPr>
-          <w:p>
-            <w:pPr>
-              <w:spacing w:before="60" w:after="60"/>
-              <w:ind w:firstLine="0"/>
-              <w:jc w:val="left"/>
-            </w:pPr>
-            <w:r/>
-            <w:r>
-              <w:rPr>
-                <w:rFonts w:ascii="Times New Roman" w:hAnsi="Times New Roman"/>
-                <w:sz w:val="21"/>
-                <w:rFonts w:ascii="Times New Roman" w:hAnsi="Times New Roman" w:cs="Times New Roman"/>
-              </w:rPr>
-              <w:t>Mạng di động (WAN/4G)</w:t>
-            </w:r>
-          </w:p>
-        </w:tc>
-        <w:tc>
-          <w:tcPr>
-            <w:tcW w:type="dxa" w:w="2324"/>
-          </w:tcPr>
-          <w:p>
-            <w:pPr>
-              <w:spacing w:before="60" w:after="60"/>
-              <w:ind w:firstLine="0"/>
-              <w:jc w:val="left"/>
-            </w:pPr>
-            <w:r/>
-            <w:r>
-              <w:rPr>
-                <w:rFonts w:ascii="Times New Roman" w:hAnsi="Times New Roman"/>
-                <w:sz w:val="21"/>
-                <w:rFonts w:ascii="Times New Roman" w:hAnsi="Times New Roman" w:cs="Times New Roman"/>
-              </w:rPr>
-              <w:t>Mobile App (4G) -&gt; Cloudflare -&gt; S7-1200</w:t>
-            </w:r>
-          </w:p>
-        </w:tc>
-        <w:tc>
-          <w:tcPr>
-            <w:tcW w:type="dxa" w:w="2324"/>
-          </w:tcPr>
-          <w:p>
-            <w:pPr>
-              <w:spacing w:before="60" w:after="60"/>
-              <w:ind w:firstLine="0"/>
-              <w:jc w:val="left"/>
-            </w:pPr>
-            <w:r/>
-            <w:r>
-              <w:rPr>
-                <w:rFonts w:ascii="Times New Roman" w:hAnsi="Times New Roman"/>
-                <w:sz w:val="21"/>
-                <w:rFonts w:ascii="Times New Roman" w:hAnsi="Times New Roman" w:cs="Times New Roman"/>
-              </w:rPr>
-              <w:t>115 ms</w:t>
-            </w:r>
-          </w:p>
-        </w:tc>
-        <w:tc>
-          <w:tcPr>
-            <w:tcW w:type="dxa" w:w="2324"/>
-          </w:tcPr>
-          <w:p>
-            <w:pPr>
-              <w:spacing w:before="60" w:after="60"/>
-              <w:ind w:firstLine="0"/>
-              <w:jc w:val="left"/>
-            </w:pPr>
-            <w:r/>
-            <w:r>
-              <w:rPr>
-                <w:rFonts w:ascii="Times New Roman" w:hAnsi="Times New Roman"/>
-                <w:sz w:val="21"/>
-                <w:rFonts w:ascii="Times New Roman" w:hAnsi="Times New Roman" w:cs="Times New Roman"/>
-              </w:rPr>
-              <w:t>Độ trễ thấp, đáp ứng tốt từ xa</w:t>
-            </w:r>
-          </w:p>
-        </w:tc>
-      </w:tr>
-      <w:tr>
-        <w:tc>
-          <w:tcPr>
-            <w:tcW w:type="dxa" w:w="2324"/>
-          </w:tcPr>
-          <w:p>
-            <w:pPr>
-              <w:spacing w:before="60" w:after="60"/>
-              <w:ind w:firstLine="0"/>
-              <w:jc w:val="left"/>
-            </w:pPr>
-            <w:r/>
-            <w:r>
-              <w:rPr>
-                <w:rFonts w:ascii="Times New Roman" w:hAnsi="Times New Roman"/>
-                <w:sz w:val="21"/>
-                <w:rFonts w:ascii="Times New Roman" w:hAnsi="Times New Roman" w:cs="Times New Roman"/>
-              </w:rPr>
-              <w:t>Truyền thông Modbus RTU</w:t>
-            </w:r>
-          </w:p>
-        </w:tc>
-        <w:tc>
-          <w:tcPr>
-            <w:tcW w:type="dxa" w:w="2324"/>
-          </w:tcPr>
-          <w:p>
-            <w:pPr>
-              <w:spacing w:before="60" w:after="60"/>
-              <w:ind w:firstLine="0"/>
-              <w:jc w:val="left"/>
-            </w:pPr>
-            <w:r/>
-            <w:r>
-              <w:rPr>
-                <w:rFonts w:ascii="Times New Roman" w:hAnsi="Times New Roman"/>
-                <w:sz w:val="21"/>
-                <w:rFonts w:ascii="Times New Roman" w:hAnsi="Times New Roman" w:cs="Times New Roman"/>
-              </w:rPr>
-              <w:t>PLC S7-1200 -&gt; Selec MFM384</w:t>
-            </w:r>
-          </w:p>
-        </w:tc>
-        <w:tc>
-          <w:tcPr>
-            <w:tcW w:type="dxa" w:w="2324"/>
-          </w:tcPr>
-          <w:p>
-            <w:pPr>
-              <w:spacing w:before="60" w:after="60"/>
-              <w:ind w:firstLine="0"/>
-              <w:jc w:val="left"/>
-            </w:pPr>
-            <w:r/>
-            <w:r>
-              <w:rPr>
-                <w:rFonts w:ascii="Times New Roman" w:hAnsi="Times New Roman"/>
-                <w:sz w:val="21"/>
-                <w:rFonts w:ascii="Times New Roman" w:hAnsi="Times New Roman" w:cs="Times New Roman"/>
-              </w:rPr>
-              <w:t>95 ms</w:t>
-            </w:r>
-          </w:p>
-        </w:tc>
-        <w:tc>
-          <w:tcPr>
-            <w:tcW w:type="dxa" w:w="2324"/>
-          </w:tcPr>
-          <w:p>
-            <w:pPr>
-              <w:spacing w:before="60" w:after="60"/>
-              <w:ind w:firstLine="0"/>
-              <w:jc w:val="left"/>
-            </w:pPr>
-            <w:r/>
-            <w:r>
-              <w:rPr>
-                <w:rFonts w:ascii="Times New Roman" w:hAnsi="Times New Roman"/>
-                <w:sz w:val="21"/>
-                <w:rFonts w:ascii="Times New Roman" w:hAnsi="Times New Roman" w:cs="Times New Roman"/>
-              </w:rPr>
-              <w:t>Chu kỳ đọc ổn định, không lỗi gói</w:t>
-            </w:r>
-          </w:p>
-        </w:tc>
-      </w:tr>
-      <w:tr>
-        <w:tc>
-          <w:tcPr>
-            <w:tcW w:type="dxa" w:w="2324"/>
-          </w:tcPr>
-          <w:p>
-            <w:pPr>
-              <w:spacing w:before="60" w:after="60"/>
-              <w:ind w:firstLine="0"/>
-              <w:jc w:val="left"/>
-            </w:pPr>
-            <w:r/>
-            <w:r>
-              <w:rPr>
-                <w:rFonts w:ascii="Times New Roman" w:hAnsi="Times New Roman"/>
-                <w:sz w:val="21"/>
-                <w:rFonts w:ascii="Times New Roman" w:hAnsi="Times New Roman" w:cs="Times New Roman"/>
-              </w:rPr>
-              <w:t>Đồng bộ nút nhấn vật lý</w:t>
-            </w:r>
-          </w:p>
-        </w:tc>
-        <w:tc>
-          <w:tcPr>
-            <w:tcW w:type="dxa" w:w="2324"/>
-          </w:tcPr>
-          <w:p>
-            <w:pPr>
-              <w:spacing w:before="60" w:after="60"/>
-              <w:ind w:firstLine="0"/>
-              <w:jc w:val="left"/>
-            </w:pPr>
-            <w:r/>
-            <w:r>
-              <w:rPr>
-                <w:rFonts w:ascii="Times New Roman" w:hAnsi="Times New Roman"/>
-                <w:sz w:val="21"/>
-                <w:rFonts w:ascii="Times New Roman" w:hAnsi="Times New Roman" w:cs="Times New Roman"/>
-              </w:rPr>
-              <w:t>Tiếp điểm DI -&gt; Mobile App</w:t>
-            </w:r>
-          </w:p>
-        </w:tc>
-        <w:tc>
-          <w:tcPr>
-            <w:tcW w:type="dxa" w:w="2324"/>
-          </w:tcPr>
-          <w:p>
-            <w:pPr>
-              <w:spacing w:before="60" w:after="60"/>
-              <w:ind w:firstLine="0"/>
-              <w:jc w:val="left"/>
-            </w:pPr>
-            <w:r/>
-            <w:r>
-              <w:rPr>
-                <w:rFonts w:ascii="Times New Roman" w:hAnsi="Times New Roman"/>
-                <w:sz w:val="21"/>
-                <w:rFonts w:ascii="Times New Roman" w:hAnsi="Times New Roman" w:cs="Times New Roman"/>
-              </w:rPr>
-              <w:t>45 ms</w:t>
-            </w:r>
-          </w:p>
-        </w:tc>
-        <w:tc>
-          <w:tcPr>
-            <w:tcW w:type="dxa" w:w="2324"/>
-          </w:tcPr>
-          <w:p>
-            <w:pPr>
-              <w:spacing w:before="60" w:after="60"/>
-              <w:ind w:firstLine="0"/>
-              <w:jc w:val="left"/>
-            </w:pPr>
-            <w:r/>
-            <w:r>
-              <w:rPr>
-                <w:rFonts w:ascii="Times New Roman" w:hAnsi="Times New Roman"/>
-                <w:sz w:val="21"/>
-                <w:rFonts w:ascii="Times New Roman" w:hAnsi="Times New Roman" w:cs="Times New Roman"/>
-              </w:rPr>
-              <w:t>Đồng bộ tức thời, phản hồi nhanh</w:t>
-            </w:r>
-          </w:p>
-        </w:tc>
-      </w:tr>
-    </w:tbl>
     <w:p>
       <w:pPr>
         <w:keepNext/>
@@ -4116,11 +2949,7 @@
       <w:r>
         <w:rPr>
           <w:rFonts w:ascii="Times New Roman" w:hAnsi="Times New Roman"/>
-          <w:b/>
-          <w:sz w:val="22"/>
-          <w:rFonts w:ascii="Times New Roman" w:hAnsi="Times New Roman" w:cs="Times New Roman"/>
         </w:rPr>
-        <w:t>Bảng 4. Kết quả thực nghiệm độ trễ truyền thông điều khiển hệ thống HEMS</w:t>
       </w:r>
     </w:p>
     <w:p>

</xml_diff>